<commit_message>
Add Dockerfiles, docker-compose, docker-entrypoint and README Docker instructions; add Postman/newman and unit tests
</commit_message>
<xml_diff>
--- a/SmartFeeApartment.docx
+++ b/SmartFeeApartment.docx
@@ -11009,17 +11009,16 @@
           <w:numId w:val="18"/>
         </w:numPr>
       </w:pPr>
-      <w:commentRangeStart w:id="27"/>
       <w:r>
         <w:rPr>
           <w:noProof/>
         </w:rPr>
         <w:lastRenderedPageBreak/>
         <w:drawing>
-          <wp:inline distT="0" distB="0" distL="0" distR="0" wp14:anchorId="38D1E8D2" wp14:editId="3945FFF7">
-            <wp:extent cx="5731510" cy="5029835"/>
-            <wp:effectExtent l="0" t="0" r="2540" b="0"/>
-            <wp:docPr id="580638936" name="Picture 1"/>
+          <wp:inline distT="0" distB="0" distL="0" distR="0" wp14:anchorId="7C70F53F" wp14:editId="70E7C041">
+            <wp:extent cx="5448300" cy="5495925"/>
+            <wp:effectExtent l="0" t="0" r="0" b="0"/>
+            <wp:docPr id="1800798523" name="drawing"/>
             <wp:cNvGraphicFramePr>
               <a:graphicFrameLocks xmlns:a="http://schemas.openxmlformats.org/drawingml/2006/main" noChangeAspect="1"/>
             </wp:cNvGraphicFramePr>
@@ -11027,11 +11026,17 @@
               <a:graphicData uri="http://schemas.openxmlformats.org/drawingml/2006/picture">
                 <pic:pic xmlns:pic="http://schemas.openxmlformats.org/drawingml/2006/picture">
                   <pic:nvPicPr>
-                    <pic:cNvPr id="580638936" name=""/>
+                    <pic:cNvPr id="1800798523" name="Picture 1800798523"/>
                     <pic:cNvPicPr/>
                   </pic:nvPicPr>
                   <pic:blipFill>
-                    <a:blip r:embed="rId16"/>
+                    <a:blip r:embed="rId16">
+                      <a:extLst>
+                        <a:ext uri="{28A0092B-C50C-407E-A947-70E740481C1C}">
+                          <a14:useLocalDpi xmlns:a14="http://schemas.microsoft.com/office/drawing/2010/main"/>
+                        </a:ext>
+                      </a:extLst>
+                    </a:blip>
                     <a:stretch>
                       <a:fillRect/>
                     </a:stretch>
@@ -11039,7 +11044,7 @@
                   <pic:spPr>
                     <a:xfrm>
                       <a:off x="0" y="0"/>
-                      <a:ext cx="5731510" cy="5029835"/>
+                      <a:ext cx="5448300" cy="5495925"/>
                     </a:xfrm>
                     <a:prstGeom prst="rect">
                       <a:avLst/>
@@ -11051,21 +11056,12 @@
           </wp:inline>
         </w:drawing>
       </w:r>
-      <w:commentRangeEnd w:id="27"/>
-      <w:r>
-        <w:rPr>
-          <w:rStyle w:val="CommentReference"/>
-          <w:sz w:val="28"/>
-          <w:szCs w:val="28"/>
-        </w:rPr>
-        <w:commentReference w:id="27"/>
-      </w:r>
     </w:p>
     <w:p>
       <w:pPr>
         <w:pStyle w:val="Caption"/>
       </w:pPr>
-      <w:bookmarkStart w:id="28" w:name="_Toc227740222"/>
+      <w:bookmarkStart w:id="27" w:name="_Toc227740222"/>
       <w:r>
         <w:t xml:space="preserve">Hình </w:t>
       </w:r>
@@ -11090,7 +11086,7 @@
       <w:r>
         <w:t xml:space="preserve"> Use-case thanh toán trực tuyến</w:t>
       </w:r>
-      <w:bookmarkEnd w:id="28"/>
+      <w:bookmarkEnd w:id="27"/>
     </w:p>
     <w:p>
       <w:pPr>
@@ -11266,6 +11262,7 @@
           <w:b/>
           <w:bCs/>
         </w:rPr>
+        <w:lastRenderedPageBreak/>
         <w:t>Use case liên quan:</w:t>
       </w:r>
       <w:r>
@@ -11284,7 +11281,6 @@
           <w:b/>
           <w:bCs/>
         </w:rPr>
-        <w:lastRenderedPageBreak/>
         <w:t>3. UC-R03: Tra cứu lịch sử tiêu thụ và thanh toán</w:t>
       </w:r>
     </w:p>
@@ -11415,10 +11411,10 @@
           <w:noProof/>
         </w:rPr>
         <w:drawing>
-          <wp:inline distT="0" distB="0" distL="0" distR="0" wp14:anchorId="39B237FB" wp14:editId="7FD29A80">
-            <wp:extent cx="5731510" cy="6236970"/>
-            <wp:effectExtent l="0" t="0" r="2540" b="0"/>
-            <wp:docPr id="1389416926" name="Picture 1"/>
+          <wp:inline distT="0" distB="0" distL="0" distR="0" wp14:anchorId="7E5B9DE0" wp14:editId="5171F95D">
+            <wp:extent cx="5495925" cy="3457575"/>
+            <wp:effectExtent l="0" t="0" r="0" b="0"/>
+            <wp:docPr id="842141815" name="drawing"/>
             <wp:cNvGraphicFramePr>
               <a:graphicFrameLocks xmlns:a="http://schemas.openxmlformats.org/drawingml/2006/main" noChangeAspect="1"/>
             </wp:cNvGraphicFramePr>
@@ -11426,11 +11422,17 @@
               <a:graphicData uri="http://schemas.openxmlformats.org/drawingml/2006/picture">
                 <pic:pic xmlns:pic="http://schemas.openxmlformats.org/drawingml/2006/picture">
                   <pic:nvPicPr>
-                    <pic:cNvPr id="1389416926" name=""/>
+                    <pic:cNvPr id="842141815" name="Picture 842141815"/>
                     <pic:cNvPicPr/>
                   </pic:nvPicPr>
                   <pic:blipFill>
-                    <a:blip r:embed="rId17"/>
+                    <a:blip r:embed="rId17">
+                      <a:extLst>
+                        <a:ext uri="{28A0092B-C50C-407E-A947-70E740481C1C}">
+                          <a14:useLocalDpi xmlns:a14="http://schemas.microsoft.com/office/drawing/2010/main"/>
+                        </a:ext>
+                      </a:extLst>
+                    </a:blip>
                     <a:stretch>
                       <a:fillRect/>
                     </a:stretch>
@@ -11438,7 +11440,7 @@
                   <pic:spPr>
                     <a:xfrm>
                       <a:off x="0" y="0"/>
-                      <a:ext cx="5731510" cy="6236970"/>
+                      <a:ext cx="5495925" cy="3457575"/>
                     </a:xfrm>
                     <a:prstGeom prst="rect">
                       <a:avLst/>
@@ -11455,7 +11457,7 @@
       <w:pPr>
         <w:pStyle w:val="Caption"/>
       </w:pPr>
-      <w:bookmarkStart w:id="29" w:name="_Toc227740223"/>
+      <w:bookmarkStart w:id="28" w:name="_Toc227740223"/>
       <w:r>
         <w:t xml:space="preserve">Hình </w:t>
       </w:r>
@@ -11480,7 +11482,7 @@
       <w:r>
         <w:t xml:space="preserve"> Use-case tra cứu lịch sử tiêu thụ và thanh toán</w:t>
       </w:r>
-      <w:bookmarkEnd w:id="29"/>
+      <w:bookmarkEnd w:id="28"/>
     </w:p>
     <w:p>
       <w:pPr>
@@ -11494,7 +11496,6 @@
           <w:b/>
           <w:bCs/>
         </w:rPr>
-        <w:lastRenderedPageBreak/>
         <w:t>Luồng chính:</w:t>
       </w:r>
     </w:p>
@@ -11554,6 +11555,7 @@
           <w:b/>
           <w:bCs/>
         </w:rPr>
+        <w:lastRenderedPageBreak/>
         <w:t>Ngoại lệ:</w:t>
       </w:r>
       <w:r>
@@ -11900,7 +11902,6 @@
           <w:b/>
           <w:bCs/>
         </w:rPr>
-        <w:lastRenderedPageBreak/>
         <w:t>Tác nhân:</w:t>
       </w:r>
       <w:r>
@@ -12007,6 +12008,7 @@
         </w:numPr>
       </w:pPr>
       <w:r>
+        <w:lastRenderedPageBreak/>
         <w:t>Hệ thống tạo mã Ticket xử lý và gửi thông báo đến bộ phận hành chính BQL.</w:t>
       </w:r>
     </w:p>
@@ -12273,10 +12275,10 @@
         </w:rPr>
         <w:lastRenderedPageBreak/>
         <w:drawing>
-          <wp:inline distT="0" distB="0" distL="0" distR="0" wp14:anchorId="4F6D5066" wp14:editId="3EB317D3">
-            <wp:extent cx="5731510" cy="4876800"/>
-            <wp:effectExtent l="0" t="0" r="2540" b="0"/>
-            <wp:docPr id="819700255" name="Picture 1"/>
+          <wp:inline distT="0" distB="0" distL="0" distR="0" wp14:anchorId="2F1376AB" wp14:editId="1E95057B">
+            <wp:extent cx="5495925" cy="5372100"/>
+            <wp:effectExtent l="0" t="0" r="0" b="0"/>
+            <wp:docPr id="346990778" name="drawing"/>
             <wp:cNvGraphicFramePr>
               <a:graphicFrameLocks xmlns:a="http://schemas.openxmlformats.org/drawingml/2006/main" noChangeAspect="1"/>
             </wp:cNvGraphicFramePr>
@@ -12284,11 +12286,17 @@
               <a:graphicData uri="http://schemas.openxmlformats.org/drawingml/2006/picture">
                 <pic:pic xmlns:pic="http://schemas.openxmlformats.org/drawingml/2006/picture">
                   <pic:nvPicPr>
-                    <pic:cNvPr id="819700255" name=""/>
+                    <pic:cNvPr id="346990778" name="Picture 346990778"/>
                     <pic:cNvPicPr/>
                   </pic:nvPicPr>
                   <pic:blipFill>
-                    <a:blip r:embed="rId18"/>
+                    <a:blip r:embed="rId18">
+                      <a:extLst>
+                        <a:ext uri="{28A0092B-C50C-407E-A947-70E740481C1C}">
+                          <a14:useLocalDpi xmlns:a14="http://schemas.microsoft.com/office/drawing/2010/main"/>
+                        </a:ext>
+                      </a:extLst>
+                    </a:blip>
                     <a:stretch>
                       <a:fillRect/>
                     </a:stretch>
@@ -12296,7 +12304,7 @@
                   <pic:spPr>
                     <a:xfrm>
                       <a:off x="0" y="0"/>
-                      <a:ext cx="5731510" cy="4876800"/>
+                      <a:ext cx="5495925" cy="5372100"/>
                     </a:xfrm>
                     <a:prstGeom prst="rect">
                       <a:avLst/>
@@ -12313,7 +12321,7 @@
       <w:pPr>
         <w:pStyle w:val="Caption"/>
       </w:pPr>
-      <w:bookmarkStart w:id="30" w:name="_Toc227740224"/>
+      <w:bookmarkStart w:id="29" w:name="_Toc227740224"/>
       <w:r>
         <w:t xml:space="preserve">Hình </w:t>
       </w:r>
@@ -12338,7 +12346,7 @@
       <w:r>
         <w:t xml:space="preserve"> Use-case đăng nhập</w:t>
       </w:r>
-      <w:bookmarkEnd w:id="30"/>
+      <w:bookmarkEnd w:id="29"/>
     </w:p>
     <w:p>
       <w:pPr>
@@ -12500,6 +12508,7 @@
           <w:b/>
           <w:bCs/>
         </w:rPr>
+        <w:lastRenderedPageBreak/>
         <w:t>7</w:t>
       </w:r>
       <w:r>
@@ -12564,7 +12573,6 @@
           <w:b/>
           <w:bCs/>
         </w:rPr>
-        <w:lastRenderedPageBreak/>
         <w:t>Tác nhân:</w:t>
       </w:r>
       <w:r>
@@ -12884,21 +12892,21 @@
       <w:pPr>
         <w:pStyle w:val="Heading3"/>
       </w:pPr>
-      <w:bookmarkStart w:id="31" w:name="_Toc219879189"/>
-      <w:bookmarkStart w:id="32" w:name="_Toc220411301"/>
-      <w:bookmarkStart w:id="33" w:name="_Toc227612282"/>
+      <w:bookmarkStart w:id="30" w:name="_Toc219879189"/>
+      <w:bookmarkStart w:id="31" w:name="_Toc220411301"/>
+      <w:bookmarkStart w:id="32" w:name="_Toc227612282"/>
       <w:r>
         <w:t xml:space="preserve">2.1.2 </w:t>
       </w:r>
       <w:r>
         <w:t xml:space="preserve">PHÂN HỆ 2: BAN QUẢN </w:t>
       </w:r>
+      <w:bookmarkEnd w:id="30"/>
       <w:bookmarkEnd w:id="31"/>
+      <w:r>
+        <w:t>LÝ</w:t>
+      </w:r>
       <w:bookmarkEnd w:id="32"/>
-      <w:r>
-        <w:t>LÝ</w:t>
-      </w:r>
-      <w:bookmarkEnd w:id="33"/>
     </w:p>
     <w:p>
       <w:pPr>
@@ -13051,6 +13059,7 @@
         </w:numPr>
       </w:pPr>
       <w:r>
+        <w:lastRenderedPageBreak/>
         <w:t>Hệ thống hiển thị chỉ số tháng trước.</w:t>
       </w:r>
     </w:p>
@@ -13073,7 +13082,6 @@
         </w:numPr>
       </w:pPr>
       <w:r>
-        <w:lastRenderedPageBreak/>
         <w:t xml:space="preserve">Hệ thống kiểm tra: Nếu số mới </w:t>
       </w:r>
       <w:r>
@@ -13403,9 +13411,9 @@
       <w:pPr>
         <w:pStyle w:val="Heading3"/>
       </w:pPr>
-      <w:bookmarkStart w:id="34" w:name="_Toc219879190"/>
-      <w:bookmarkStart w:id="35" w:name="_Toc220411302"/>
-      <w:bookmarkStart w:id="36" w:name="_Toc227612283"/>
+      <w:bookmarkStart w:id="33" w:name="_Toc219879190"/>
+      <w:bookmarkStart w:id="34" w:name="_Toc220411302"/>
+      <w:bookmarkStart w:id="35" w:name="_Toc227612283"/>
       <w:r>
         <w:t>2.</w:t>
       </w:r>
@@ -13415,9 +13423,9 @@
       <w:r>
         <w:t>PHÂN HỆ 3: KẾ TOÁN (FINANCE)</w:t>
       </w:r>
+      <w:bookmarkEnd w:id="33"/>
       <w:bookmarkEnd w:id="34"/>
       <w:bookmarkEnd w:id="35"/>
-      <w:bookmarkEnd w:id="36"/>
     </w:p>
     <w:p>
       <w:pPr>
@@ -13482,6 +13490,7 @@
           <w:b/>
           <w:bCs/>
         </w:rPr>
+        <w:lastRenderedPageBreak/>
         <w:t>Tiền điều kiện:</w:t>
       </w:r>
       <w:r>
@@ -13500,7 +13509,6 @@
           <w:b/>
           <w:bCs/>
         </w:rPr>
-        <w:lastRenderedPageBreak/>
         <w:t>Hậu điều kiện:</w:t>
       </w:r>
       <w:r>
@@ -13956,6 +13964,7 @@
           <w:b/>
           <w:bCs/>
         </w:rPr>
+        <w:lastRenderedPageBreak/>
         <w:t>Ngoại lệ:</w:t>
       </w:r>
       <w:r>
@@ -14015,7 +14024,6 @@
     </w:p>
     <w:p>
       <w:r>
-        <w:lastRenderedPageBreak/>
         <w:pict w14:anchorId="5CAD8D04">
           <v:rect id="_x0000_i1030" style="width:0;height:1.5pt" o:hralign="center" o:hrstd="t" o:hrnoshade="t" o:hr="t" fillcolor="gray" stroked="f"/>
         </w:pict>
@@ -14025,9 +14033,9 @@
       <w:pPr>
         <w:pStyle w:val="Heading3"/>
       </w:pPr>
-      <w:bookmarkStart w:id="37" w:name="_Toc219879191"/>
-      <w:bookmarkStart w:id="38" w:name="_Toc220411303"/>
-      <w:bookmarkStart w:id="39" w:name="_Toc227612284"/>
+      <w:bookmarkStart w:id="36" w:name="_Toc219879191"/>
+      <w:bookmarkStart w:id="37" w:name="_Toc220411303"/>
+      <w:bookmarkStart w:id="38" w:name="_Toc227612284"/>
       <w:r>
         <w:t>2.</w:t>
       </w:r>
@@ -14037,9 +14045,9 @@
       <w:r>
         <w:t>PHÂN HỆ 4: QUẢN TRỊ (ADMIN)</w:t>
       </w:r>
+      <w:bookmarkEnd w:id="36"/>
       <w:bookmarkEnd w:id="37"/>
       <w:bookmarkEnd w:id="38"/>
-      <w:bookmarkEnd w:id="39"/>
     </w:p>
     <w:p>
       <w:pPr>
@@ -14312,9 +14320,9 @@
       <w:pPr>
         <w:pStyle w:val="Heading3"/>
       </w:pPr>
-      <w:bookmarkStart w:id="40" w:name="_Toc219879192"/>
-      <w:bookmarkStart w:id="41" w:name="_Toc220411304"/>
-      <w:bookmarkStart w:id="42" w:name="_Toc227612285"/>
+      <w:bookmarkStart w:id="39" w:name="_Toc219879192"/>
+      <w:bookmarkStart w:id="40" w:name="_Toc220411304"/>
+      <w:bookmarkStart w:id="41" w:name="_Toc227612285"/>
       <w:r>
         <w:t>2.</w:t>
       </w:r>
@@ -14333,9 +14341,9 @@
       <w:r>
         <w:t>TỔNG HỢP CÁC USE CASE KHÁC (TÓM TẮT)</w:t>
       </w:r>
+      <w:bookmarkEnd w:id="39"/>
       <w:bookmarkEnd w:id="40"/>
       <w:bookmarkEnd w:id="41"/>
-      <w:bookmarkEnd w:id="42"/>
     </w:p>
     <w:p>
       <w:pPr>
@@ -14456,6 +14464,7 @@
         </w:numPr>
       </w:pPr>
       <w:r>
+        <w:lastRenderedPageBreak/>
         <w:t>Hệ thống quét bảng Invoices để tìm các bản ghi quá hạn.</w:t>
       </w:r>
     </w:p>
@@ -14478,7 +14487,6 @@
         </w:numPr>
       </w:pPr>
       <w:r>
-        <w:lastRenderedPageBreak/>
         <w:t>Hệ thống áp dụng mẫu tin nhắn nhắc nợ đã soạn sẵn.</w:t>
       </w:r>
     </w:p>
@@ -14616,23 +14624,23 @@
       <w:pPr>
         <w:pStyle w:val="Heading2"/>
       </w:pPr>
-      <w:bookmarkStart w:id="43" w:name="_Toc227612286"/>
-      <w:commentRangeStart w:id="44"/>
+      <w:bookmarkStart w:id="42" w:name="_Toc227612286"/>
+      <w:commentRangeStart w:id="43"/>
       <w:r>
         <w:t xml:space="preserve">2.2 MÔ HÌNH HÓA QUY TRÌNH (PROCESS </w:t>
       </w:r>
       <w:r>
         <w:t>MODELING)</w:t>
       </w:r>
-      <w:bookmarkEnd w:id="43"/>
-      <w:commentRangeEnd w:id="44"/>
+      <w:bookmarkEnd w:id="42"/>
+      <w:commentRangeEnd w:id="43"/>
       <w:r>
         <w:rPr>
           <w:rStyle w:val="CommentReference"/>
           <w:sz w:val="32"/>
           <w:szCs w:val="40"/>
         </w:rPr>
-        <w:commentReference w:id="44"/>
+        <w:commentReference w:id="43"/>
       </w:r>
     </w:p>
     <w:p>
@@ -14725,31 +14733,31 @@
       <w:pPr>
         <w:pStyle w:val="Heading2"/>
       </w:pPr>
-      <w:bookmarkStart w:id="45" w:name="_Toc227612287"/>
-      <w:commentRangeStart w:id="46"/>
+      <w:bookmarkStart w:id="44" w:name="_Toc227612287"/>
+      <w:commentRangeStart w:id="45"/>
       <w:r>
         <w:t>2.3 MÔ HÌNH HÓA DỮ LIỆU KHÁI NIỆM (CONCEPTUAL DATA MODELING)</w:t>
       </w:r>
-      <w:bookmarkEnd w:id="45"/>
-      <w:commentRangeEnd w:id="46"/>
+      <w:bookmarkEnd w:id="44"/>
+      <w:commentRangeEnd w:id="45"/>
       <w:r>
         <w:rPr>
           <w:rStyle w:val="CommentReference"/>
           <w:sz w:val="32"/>
           <w:szCs w:val="40"/>
         </w:rPr>
-        <w:commentReference w:id="46"/>
+        <w:commentReference w:id="45"/>
       </w:r>
     </w:p>
     <w:p>
       <w:pPr>
         <w:pStyle w:val="Heading3"/>
       </w:pPr>
-      <w:bookmarkStart w:id="47" w:name="_Toc227612288"/>
+      <w:bookmarkStart w:id="46" w:name="_Toc227612288"/>
       <w:r>
         <w:t>2.3.1 Danh mục Thực thể (Entity Catalog)</w:t>
       </w:r>
-      <w:bookmarkEnd w:id="47"/>
+      <w:bookmarkEnd w:id="46"/>
       <w:r>
         <w:t xml:space="preserve"> </w:t>
       </w:r>
@@ -14950,6 +14958,7 @@
               <w:jc w:val="center"/>
             </w:pPr>
             <w:r>
+              <w:lastRenderedPageBreak/>
               <w:t>Apartment (Căn hộ)</w:t>
             </w:r>
           </w:p>
@@ -15032,7 +15041,6 @@
               <w:jc w:val="center"/>
             </w:pPr>
             <w:r>
-              <w:lastRenderedPageBreak/>
               <w:t>Invoice (Hóa đơn)</w:t>
             </w:r>
           </w:p>
@@ -15277,11 +15285,11 @@
       <w:pPr>
         <w:pStyle w:val="Heading3"/>
       </w:pPr>
-      <w:bookmarkStart w:id="48" w:name="_Toc227612289"/>
+      <w:bookmarkStart w:id="47" w:name="_Toc227612289"/>
       <w:r>
         <w:t>2.3.2 Danh mục Mối quan hệ (Relationship Catalog)</w:t>
       </w:r>
-      <w:bookmarkEnd w:id="48"/>
+      <w:bookmarkEnd w:id="47"/>
       <w:r>
         <w:t xml:space="preserve"> </w:t>
       </w:r>
@@ -15822,7 +15830,11 @@
               <w:cnfStyle w:val="000000000000" w:firstRow="0" w:lastRow="0" w:firstColumn="0" w:lastColumn="0" w:oddVBand="0" w:evenVBand="0" w:oddHBand="0" w:evenHBand="0" w:firstRowFirstColumn="0" w:firstRowLastColumn="0" w:lastRowFirstColumn="0" w:lastRowLastColumn="0"/>
             </w:pPr>
             <w:r>
-              <w:t>Quản trị viên Quản lý / Hóa đơn Được duyệt bởi</w:t>
+              <w:t xml:space="preserve">Quản trị viên Quản lý / Hóa </w:t>
+            </w:r>
+            <w:r>
+              <w:lastRenderedPageBreak/>
+              <w:t>đơn Được duyệt bởi</w:t>
             </w:r>
           </w:p>
         </w:tc>
@@ -15839,6 +15851,7 @@
               <w:cnfStyle w:val="000000000000" w:firstRow="0" w:lastRow="0" w:firstColumn="0" w:lastColumn="0" w:oddVBand="0" w:evenVBand="0" w:oddHBand="0" w:evenHBand="0" w:firstRowFirstColumn="0" w:firstRowLastColumn="0" w:lastRowFirstColumn="0" w:lastRowLastColumn="0"/>
             </w:pPr>
             <w:r>
+              <w:lastRenderedPageBreak/>
               <w:t>1 : M</w:t>
             </w:r>
           </w:p>
@@ -15867,12 +15880,11 @@
       <w:pPr>
         <w:pStyle w:val="Heading3"/>
       </w:pPr>
-      <w:bookmarkStart w:id="49" w:name="_Toc227612290"/>
-      <w:r>
-        <w:lastRenderedPageBreak/>
+      <w:bookmarkStart w:id="48" w:name="_Toc227612290"/>
+      <w:r>
         <w:t>2.3.3 Các thuộc tính và Định danh chính (Key Attributes &amp; Identifiers)</w:t>
       </w:r>
-      <w:bookmarkEnd w:id="49"/>
+      <w:bookmarkEnd w:id="48"/>
       <w:r>
         <w:t xml:space="preserve"> </w:t>
       </w:r>
@@ -15977,11 +15989,11 @@
       <w:pPr>
         <w:pStyle w:val="Heading3"/>
       </w:pPr>
-      <w:bookmarkStart w:id="50" w:name="_Toc227612291"/>
+      <w:bookmarkStart w:id="49" w:name="_Toc227612291"/>
       <w:r>
         <w:t>2.3.4 Danh mục Quy tắc Nghiệp vụ (Business Rules Catalog)</w:t>
       </w:r>
-      <w:bookmarkEnd w:id="50"/>
+      <w:bookmarkEnd w:id="49"/>
       <w:r>
         <w:t xml:space="preserve"> </w:t>
       </w:r>
@@ -16607,6 +16619,7 @@
                 <w:b w:val="0"/>
                 <w:bCs w:val="0"/>
               </w:rPr>
+              <w:lastRenderedPageBreak/>
               <w:t>BR-06</w:t>
             </w:r>
           </w:p>
@@ -16697,7 +16710,6 @@
                 <w:b w:val="0"/>
                 <w:bCs w:val="0"/>
               </w:rPr>
-              <w:lastRenderedPageBreak/>
               <w:t>BR-07</w:t>
             </w:r>
           </w:p>
@@ -17055,7 +17067,7 @@
       <w:pPr>
         <w:pStyle w:val="Heading3"/>
       </w:pPr>
-      <w:bookmarkStart w:id="51" w:name="_Toc227612292"/>
+      <w:bookmarkStart w:id="50" w:name="_Toc227612292"/>
       <w:r>
         <w:t>2.3.</w:t>
       </w:r>
@@ -17065,7 +17077,7 @@
       <w:r>
         <w:t xml:space="preserve"> Các ghi chú và giả định (Notes &amp; Assumptions):</w:t>
       </w:r>
-      <w:bookmarkEnd w:id="51"/>
+      <w:bookmarkEnd w:id="50"/>
     </w:p>
     <w:p>
       <w:pPr>
@@ -17125,26 +17137,21 @@
       <w:pPr>
         <w:pStyle w:val="Heading3"/>
       </w:pPr>
-      <w:bookmarkStart w:id="52" w:name="_Toc227612293"/>
-      <w:commentRangeStart w:id="53"/>
-      <w:r>
-        <w:t>2.3.</w:t>
-      </w:r>
-      <w:r>
-        <w:t>6</w:t>
-      </w:r>
-      <w:r>
-        <w:t xml:space="preserve"> Sơ đồ ERD khái niệm (Conceptual ERD)</w:t>
-      </w:r>
-      <w:bookmarkEnd w:id="52"/>
-      <w:commentRangeEnd w:id="53"/>
+      <w:bookmarkStart w:id="51" w:name="_Toc227612293"/>
+      <w:commentRangeStart w:id="52"/>
+      <w:r>
+        <w:lastRenderedPageBreak/>
+        <w:t>2.3.6 Sơ đồ ERD khái niệm (Conceptual ERD)</w:t>
+      </w:r>
+      <w:bookmarkEnd w:id="51"/>
+      <w:commentRangeEnd w:id="52"/>
       <w:r>
         <w:rPr>
           <w:rStyle w:val="CommentReference"/>
           <w:sz w:val="28"/>
           <w:szCs w:val="35"/>
         </w:rPr>
-        <w:commentReference w:id="53"/>
+        <w:commentReference w:id="52"/>
       </w:r>
     </w:p>
     <w:p>
@@ -17153,101 +17160,19 @@
           <w:i/>
           <w:iCs/>
         </w:rPr>
-        <w:t>(Chèn ERD vào đây</w:t>
-      </w:r>
-      <w:r>
-        <w:rPr>
-          <w:i/>
-          <w:iCs/>
-        </w:rPr>
-        <w:t>)</w:t>
-      </w:r>
-      <w:bookmarkStart w:id="54" w:name="_Toc220411313"/>
-      <w:commentRangeStart w:id="55"/>
-      <w:r>
-        <w:rPr>
-          <w:noProof/>
-          <w14:ligatures w14:val="standardContextual"/>
-        </w:rPr>
-        <mc:AlternateContent>
-          <mc:Choice Requires="wps">
-            <w:drawing>
-              <wp:anchor distT="0" distB="0" distL="114300" distR="114300" simplePos="0" relativeHeight="251658244" behindDoc="0" locked="0" layoutInCell="1" allowOverlap="1" wp14:anchorId="1F4ADD28" wp14:editId="66796F81">
-                <wp:simplePos x="0" y="0"/>
-                <wp:positionH relativeFrom="column">
-                  <wp:posOffset>4592955</wp:posOffset>
-                </wp:positionH>
-                <wp:positionV relativeFrom="paragraph">
-                  <wp:posOffset>785083</wp:posOffset>
-                </wp:positionV>
-                <wp:extent cx="939262" cy="450293"/>
-                <wp:effectExtent l="0" t="0" r="0" b="6985"/>
-                <wp:wrapNone/>
-                <wp:docPr id="1711227001" name="Rectangle 3"/>
-                <wp:cNvGraphicFramePr/>
-                <a:graphic xmlns:a="http://schemas.openxmlformats.org/drawingml/2006/main">
-                  <a:graphicData uri="http://schemas.microsoft.com/office/word/2010/wordprocessingShape">
-                    <wps:wsp>
-                      <wps:cNvSpPr/>
-                      <wps:spPr>
-                        <a:xfrm>
-                          <a:off x="0" y="0"/>
-                          <a:ext cx="939262" cy="450293"/>
-                        </a:xfrm>
-                        <a:prstGeom prst="rect">
-                          <a:avLst/>
-                        </a:prstGeom>
-                        <a:solidFill>
-                          <a:schemeClr val="bg1"/>
-                        </a:solidFill>
-                        <a:ln>
-                          <a:noFill/>
-                        </a:ln>
-                      </wps:spPr>
-                      <wps:style>
-                        <a:lnRef idx="2">
-                          <a:schemeClr val="accent1">
-                            <a:shade val="15000"/>
-                          </a:schemeClr>
-                        </a:lnRef>
-                        <a:fillRef idx="1">
-                          <a:schemeClr val="accent1"/>
-                        </a:fillRef>
-                        <a:effectRef idx="0">
-                          <a:schemeClr val="accent1"/>
-                        </a:effectRef>
-                        <a:fontRef idx="minor">
-                          <a:schemeClr val="lt1"/>
-                        </a:fontRef>
-                      </wps:style>
-                      <wps:bodyPr rot="0" spcFirstLastPara="0" vertOverflow="overflow" horzOverflow="overflow" vert="horz" wrap="square" lIns="91440" tIns="45720" rIns="91440" bIns="45720" numCol="1" spcCol="0" rtlCol="0" fromWordArt="0" anchor="ctr" anchorCtr="0" forceAA="0" compatLnSpc="1">
-                        <a:prstTxWarp prst="textNoShape">
-                          <a:avLst/>
-                        </a:prstTxWarp>
-                        <a:noAutofit/>
-                      </wps:bodyPr>
-                    </wps:wsp>
-                  </a:graphicData>
-                </a:graphic>
-              </wp:anchor>
-            </w:drawing>
-          </mc:Choice>
-          <mc:Fallback>
-            <w:pict>
-              <v:rect w14:anchorId="5248B7B5" id="Rectangle 3" o:spid="_x0000_s1026" style="position:absolute;margin-left:361.65pt;margin-top:61.8pt;width:73.95pt;height:35.45pt;z-index:251658244;visibility:visible;mso-wrap-style:square;mso-wrap-distance-left:9pt;mso-wrap-distance-top:0;mso-wrap-distance-right:9pt;mso-wrap-distance-bottom:0;mso-position-horizontal:absolute;mso-position-horizontal-relative:text;mso-position-vertical:absolute;mso-position-vertical-relative:text;v-text-anchor:middle" o:gfxdata="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" fillcolor="white [3212]" stroked="f" strokeweight="1pt"/>
-            </w:pict>
-          </mc:Fallback>
-        </mc:AlternateContent>
-      </w:r>
-      <w:bookmarkEnd w:id="54"/>
-      <w:commentRangeEnd w:id="55"/>
+        <w:t>(Chèn ERD vào đây)</w:t>
+      </w:r>
+      <w:bookmarkStart w:id="53" w:name="_Toc220411313"/>
+      <w:bookmarkEnd w:id="53"/>
+      <w:commentRangeStart w:id="54"/>
+      <w:commentRangeEnd w:id="54"/>
       <w:r>
         <w:rPr>
           <w:rStyle w:val="CommentReference"/>
           <w:sz w:val="28"/>
           <w:szCs w:val="28"/>
         </w:rPr>
-        <w:commentReference w:id="55"/>
+        <w:commentReference w:id="54"/>
       </w:r>
       <w:r>
         <w:pict w14:anchorId="02984475">
@@ -17255,36 +17180,84 @@
         </w:pict>
       </w:r>
     </w:p>
+    <w:p/>
+    <w:p>
+      <w:r>
+        <w:rPr>
+          <w:noProof/>
+        </w:rPr>
+        <w:drawing>
+          <wp:inline distT="0" distB="0" distL="0" distR="0" wp14:anchorId="47A8DC3F" wp14:editId="02C3F3B1">
+            <wp:extent cx="6600825" cy="2624953"/>
+            <wp:effectExtent l="0" t="0" r="0" b="0"/>
+            <wp:docPr id="1888946628" name="drawing"/>
+            <wp:cNvGraphicFramePr>
+              <a:graphicFrameLocks xmlns:a="http://schemas.openxmlformats.org/drawingml/2006/main" noChangeAspect="1"/>
+            </wp:cNvGraphicFramePr>
+            <a:graphic xmlns:a="http://schemas.openxmlformats.org/drawingml/2006/main">
+              <a:graphicData uri="http://schemas.openxmlformats.org/drawingml/2006/picture">
+                <pic:pic xmlns:pic="http://schemas.openxmlformats.org/drawingml/2006/picture">
+                  <pic:nvPicPr>
+                    <pic:cNvPr id="1876900948" name="Picture 1876900948"/>
+                    <pic:cNvPicPr/>
+                  </pic:nvPicPr>
+                  <pic:blipFill>
+                    <a:blip r:embed="rId19">
+                      <a:extLst>
+                        <a:ext uri="{28A0092B-C50C-407E-A947-70E740481C1C}">
+                          <a14:useLocalDpi xmlns:a14="http://schemas.microsoft.com/office/drawing/2010/main"/>
+                        </a:ext>
+                      </a:extLst>
+                    </a:blip>
+                    <a:stretch>
+                      <a:fillRect/>
+                    </a:stretch>
+                  </pic:blipFill>
+                  <pic:spPr>
+                    <a:xfrm>
+                      <a:off x="0" y="0"/>
+                      <a:ext cx="6600825" cy="2624953"/>
+                    </a:xfrm>
+                    <a:prstGeom prst="rect">
+                      <a:avLst/>
+                    </a:prstGeom>
+                  </pic:spPr>
+                </pic:pic>
+              </a:graphicData>
+            </a:graphic>
+          </wp:inline>
+        </w:drawing>
+      </w:r>
+    </w:p>
     <w:p>
       <w:pPr>
         <w:pStyle w:val="Heading1"/>
         <w:jc w:val="center"/>
       </w:pPr>
-      <w:bookmarkStart w:id="56" w:name="_Toc227612294"/>
-      <w:r>
-        <w:lastRenderedPageBreak/>
+      <w:bookmarkStart w:id="55" w:name="_Toc227612294"/>
+      <w:r>
         <w:t>Tuần 3: Hoàn thành yêu cầu chi tiết</w:t>
       </w:r>
+      <w:bookmarkEnd w:id="55"/>
+    </w:p>
+    <w:p>
+      <w:pPr>
+        <w:pStyle w:val="Heading2"/>
+      </w:pPr>
+      <w:bookmarkStart w:id="56" w:name="_Toc227612295"/>
+      <w:commentRangeStart w:id="57"/>
+      <w:r>
+        <w:t>3.1 TÀI LIỆU DANH SÁCH YÊU CẦU CHỨC NĂNG</w:t>
+      </w:r>
       <w:bookmarkEnd w:id="56"/>
-    </w:p>
-    <w:p>
-      <w:pPr>
-        <w:pStyle w:val="Heading2"/>
-      </w:pPr>
-      <w:bookmarkStart w:id="57" w:name="_Toc227612295"/>
-      <w:commentRangeStart w:id="58"/>
-      <w:r>
-        <w:t>3.1 TÀI LIỆU DANH SÁCH YÊU CẦU CHỨC NĂNG</w:t>
-      </w:r>
-      <w:bookmarkEnd w:id="57"/>
-      <w:commentRangeEnd w:id="58"/>
+      <w:commentRangeEnd w:id="57"/>
       <w:r>
         <w:rPr>
           <w:rStyle w:val="CommentReference"/>
           <w:sz w:val="32"/>
           <w:szCs w:val="40"/>
         </w:rPr>
-        <w:commentReference w:id="58"/>
+        <w:commentReference w:id="57"/>
       </w:r>
     </w:p>
     <w:p>
@@ -17303,11 +17276,11 @@
       <w:pPr>
         <w:pStyle w:val="Heading3"/>
       </w:pPr>
-      <w:bookmarkStart w:id="59" w:name="_Toc227612296"/>
+      <w:bookmarkStart w:id="58" w:name="_Toc227612296"/>
       <w:r>
         <w:t>3.1.1 Yêu cầu theo lĩnh vực tính năng</w:t>
       </w:r>
-      <w:bookmarkEnd w:id="59"/>
+      <w:bookmarkEnd w:id="58"/>
       <w:r>
         <w:t xml:space="preserve"> </w:t>
       </w:r>
@@ -17484,6 +17457,7 @@
           <w:b/>
           <w:bCs/>
         </w:rPr>
+        <w:lastRenderedPageBreak/>
         <w:t>REQ-002: Xem chi tiết khoản phí</w:t>
       </w:r>
     </w:p>
@@ -17650,59 +17624,261 @@
         </w:numPr>
       </w:pPr>
       <w:r>
+        <w:t>Khi</w:t>
+      </w:r>
+      <w:r>
+        <w:t xml:space="preserve"> hóa đơn ở trạng thái </w:t>
+      </w:r>
+      <w:r>
+        <w:t>“</w:t>
+      </w:r>
+      <w:r>
+        <w:t>Chưa thanh toán</w:t>
+      </w:r>
+      <w:r>
+        <w:t>”</w:t>
+      </w:r>
+      <w:r>
+        <w:t>,</w:t>
+      </w:r>
+      <w:r>
+        <w:t xml:space="preserve"> </w:t>
+      </w:r>
+      <w:r>
+        <w:t>và có</w:t>
+      </w:r>
+      <w:r>
+        <w:rPr>
+          <w:i/>
+        </w:rPr>
+        <w:t xml:space="preserve"> </w:t>
+      </w:r>
+      <w:r>
+        <w:t xml:space="preserve">cư dân nhấn nút </w:t>
+      </w:r>
+      <w:r>
+        <w:t>“</w:t>
+      </w:r>
+      <w:r>
+        <w:t>Thanh toán ngay</w:t>
+      </w:r>
+      <w:r>
+        <w:t>”</w:t>
+      </w:r>
+      <w:r>
+        <w:t>.</w:t>
+      </w:r>
+      <w:r>
+        <w:t xml:space="preserve"> </w:t>
+      </w:r>
+      <w:r>
+        <w:t>Hệ</w:t>
+      </w:r>
+      <w:r>
+        <w:t xml:space="preserve"> thống hiển thị các phương thức thanh toán khả dụng (VNPay/Momo).</w:t>
+      </w:r>
+    </w:p>
+    <w:p>
+      <w:pPr>
+        <w:numPr>
+          <w:ilvl w:val="0"/>
+          <w:numId w:val="27"/>
+        </w:numPr>
+      </w:pPr>
+      <w:r>
+        <w:rPr>
+          <w:b/>
+          <w:bCs/>
+        </w:rPr>
+        <w:t xml:space="preserve">REQ-004: Tích hợp Cổng thanh toán </w:t>
+      </w:r>
+    </w:p>
+    <w:p>
+      <w:pPr>
+        <w:numPr>
+          <w:ilvl w:val="1"/>
+          <w:numId w:val="27"/>
+        </w:numPr>
+      </w:pPr>
+      <w:r>
+        <w:rPr>
+          <w:b/>
+          <w:bCs/>
+        </w:rPr>
+        <w:t>Phát biểu:</w:t>
+      </w:r>
+      <w:r>
+        <w:t xml:space="preserve"> Hệ thống phải chuyển hướng người dùng an toàn sang ứng dụng hoặc trang web của đối tác thanh toán với đầy đủ thông tin mã giao dịch và số tiền.</w:t>
+      </w:r>
+    </w:p>
+    <w:p>
+      <w:pPr>
+        <w:numPr>
+          <w:ilvl w:val="1"/>
+          <w:numId w:val="27"/>
+        </w:numPr>
+      </w:pPr>
+      <w:r>
+        <w:rPr>
+          <w:b/>
+          <w:bCs/>
+        </w:rPr>
+        <w:t>Nguồn:</w:t>
+      </w:r>
+      <w:r>
+        <w:t xml:space="preserve"> UC-R02</w:t>
+      </w:r>
+    </w:p>
+    <w:p>
+      <w:pPr>
+        <w:numPr>
+          <w:ilvl w:val="1"/>
+          <w:numId w:val="27"/>
+        </w:numPr>
+      </w:pPr>
+      <w:r>
+        <w:rPr>
+          <w:b/>
+          <w:bCs/>
+        </w:rPr>
+        <w:t>Tiêu chí chấp nhận:</w:t>
+      </w:r>
+    </w:p>
+    <w:p>
+      <w:pPr>
+        <w:numPr>
+          <w:ilvl w:val="2"/>
+          <w:numId w:val="27"/>
+        </w:numPr>
+      </w:pPr>
+      <w:r>
+        <w:t>Cư</w:t>
+      </w:r>
+      <w:r>
+        <w:t xml:space="preserve"> dân chọn VNPay,</w:t>
+      </w:r>
+      <w:r>
+        <w:t>nhấn</w:t>
+      </w:r>
+      <w:r>
+        <w:rPr>
+          <w:i/>
+        </w:rPr>
+        <w:t xml:space="preserve"> </w:t>
+      </w:r>
+      <w:r>
+        <w:t xml:space="preserve">xác nhận thanh toán, </w:t>
+      </w:r>
+      <w:r>
+        <w:t>lúc đó</w:t>
+      </w:r>
+      <w:r>
+        <w:t xml:space="preserve"> hệ thống mở SDK/Deep link của VNPay.</w:t>
+      </w:r>
+    </w:p>
+    <w:p>
+      <w:pPr>
+        <w:numPr>
+          <w:ilvl w:val="0"/>
+          <w:numId w:val="27"/>
+        </w:numPr>
+      </w:pPr>
+      <w:r>
+        <w:rPr>
+          <w:b/>
+          <w:bCs/>
+        </w:rPr>
+        <w:t>REQ-005: Hiển thị biểu đồ tiêu thụ điện/nước</w:t>
+      </w:r>
+    </w:p>
+    <w:p>
+      <w:pPr>
+        <w:numPr>
+          <w:ilvl w:val="1"/>
+          <w:numId w:val="27"/>
+        </w:numPr>
+      </w:pPr>
+      <w:r>
+        <w:rPr>
+          <w:b/>
+          <w:bCs/>
+        </w:rPr>
+        <w:t>Phát biểu:</w:t>
+      </w:r>
+      <w:r>
+        <w:t xml:space="preserve"> Hệ thống phải tổng hợp dữ liệu và hiển thị biểu đồ so sánh mức tiêu thụ 6 tháng liên tiếp.</w:t>
+      </w:r>
+    </w:p>
+    <w:p>
+      <w:pPr>
+        <w:numPr>
+          <w:ilvl w:val="1"/>
+          <w:numId w:val="27"/>
+        </w:numPr>
+      </w:pPr>
+      <w:r>
+        <w:rPr>
+          <w:b/>
+          <w:bCs/>
+        </w:rPr>
+        <w:t>Nguồn:</w:t>
+      </w:r>
+      <w:r>
+        <w:t xml:space="preserve"> UC-R03</w:t>
+      </w:r>
+    </w:p>
+    <w:p>
+      <w:pPr>
+        <w:numPr>
+          <w:ilvl w:val="1"/>
+          <w:numId w:val="27"/>
+        </w:numPr>
+      </w:pPr>
+      <w:r>
+        <w:rPr>
+          <w:b/>
+          <w:bCs/>
+        </w:rPr>
+        <w:t>Tiêu chí chấp nhận:</w:t>
+      </w:r>
+    </w:p>
+    <w:p>
+      <w:pPr>
+        <w:numPr>
+          <w:ilvl w:val="2"/>
+          <w:numId w:val="27"/>
+        </w:numPr>
+      </w:pPr>
+      <w:r>
         <w:lastRenderedPageBreak/>
         <w:t>Khi</w:t>
       </w:r>
       <w:r>
-        <w:t xml:space="preserve"> hóa đơn ở trạng thái </w:t>
+        <w:t xml:space="preserve"> có dữ liệu chỉ số của ít nhất 2 tháng</w:t>
+      </w:r>
+      <w:r>
+        <w:t>. Cư</w:t>
+      </w:r>
+      <w:r>
+        <w:t xml:space="preserve"> dân vào mục </w:t>
       </w:r>
       <w:r>
         <w:t>“</w:t>
       </w:r>
       <w:r>
-        <w:t>Chưa thanh toán</w:t>
+        <w:t>Thống kê</w:t>
       </w:r>
       <w:r>
         <w:t>”</w:t>
       </w:r>
       <w:r>
-        <w:t>,</w:t>
-      </w:r>
-      <w:r>
-        <w:t xml:space="preserve"> </w:t>
-      </w:r>
-      <w:r>
-        <w:t>và có</w:t>
-      </w:r>
-      <w:r>
-        <w:rPr>
-          <w:i/>
-        </w:rPr>
-        <w:t xml:space="preserve"> </w:t>
-      </w:r>
-      <w:r>
-        <w:t xml:space="preserve">cư dân nhấn nút </w:t>
-      </w:r>
-      <w:r>
-        <w:t>“</w:t>
-      </w:r>
-      <w:r>
-        <w:t>Thanh toán ngay</w:t>
-      </w:r>
-      <w:r>
-        <w:t>”</w:t>
-      </w:r>
-      <w:r>
-        <w:t>.</w:t>
-      </w:r>
-      <w:r>
-        <w:t xml:space="preserve"> </w:t>
-      </w:r>
-      <w:r>
-        <w:t>Hệ</w:t>
-      </w:r>
-      <w:r>
-        <w:t xml:space="preserve"> thống hiển thị các phương thức thanh toán khả dụng (VNPay/Momo).</w:t>
+        <w:t xml:space="preserve">, hệ thống </w:t>
+      </w:r>
+      <w:r>
+        <w:t xml:space="preserve">sẽ </w:t>
+      </w:r>
+      <w:r>
+        <w:t>hiển thị biểu đồ đường thể hiện sự biến động tiêu thụ.</w:t>
       </w:r>
     </w:p>
     <w:p>
@@ -17717,7 +17893,7 @@
           <w:b/>
           <w:bCs/>
         </w:rPr>
-        <w:t xml:space="preserve">REQ-004: Tích hợp Cổng thanh toán </w:t>
+        <w:t>REQ-006: Đăng ký dịch vụ mới</w:t>
       </w:r>
     </w:p>
     <w:p>
@@ -17735,7 +17911,7 @@
         <w:t>Phát biểu:</w:t>
       </w:r>
       <w:r>
-        <w:t xml:space="preserve"> Hệ thống phải chuyển hướng người dùng an toàn sang ứng dụng hoặc trang web của đối tác thanh toán với đầy đủ thông tin mã giao dịch và số tiền.</w:t>
+        <w:t xml:space="preserve"> Hệ thống phải cung cấp form đăng ký các dịch vụ chung cư (thẻ xe, thẻ thang máy, sửa chữa).</w:t>
       </w:r>
     </w:p>
     <w:p>
@@ -17753,7 +17929,7 @@
         <w:t>Nguồn:</w:t>
       </w:r>
       <w:r>
-        <w:t xml:space="preserve"> UC-R02</w:t>
+        <w:t xml:space="preserve"> UC-R04</w:t>
       </w:r>
     </w:p>
     <w:p>
@@ -17782,10 +17958,10 @@
         <w:t>Cư</w:t>
       </w:r>
       <w:r>
-        <w:t xml:space="preserve"> dân chọn VNPay,</w:t>
-      </w:r>
-      <w:r>
-        <w:t>nhấn</w:t>
+        <w:t xml:space="preserve"> dân cần thẻ gửi xe mới, </w:t>
+      </w:r>
+      <w:r>
+        <w:t>sẽ</w:t>
       </w:r>
       <w:r>
         <w:rPr>
@@ -17794,13 +17970,31 @@
         <w:t xml:space="preserve"> </w:t>
       </w:r>
       <w:r>
-        <w:t xml:space="preserve">xác nhận thanh toán, </w:t>
-      </w:r>
-      <w:r>
-        <w:t>lúc đó</w:t>
-      </w:r>
-      <w:r>
-        <w:t xml:space="preserve"> hệ thống mở SDK/Deep link của VNPay.</w:t>
+        <w:t xml:space="preserve">điền thông tin và đính kèm ảnh giấy tờ, </w:t>
+      </w:r>
+      <w:r>
+        <w:t>rồi</w:t>
+      </w:r>
+      <w:r>
+        <w:rPr>
+          <w:i/>
+        </w:rPr>
+        <w:t xml:space="preserve"> </w:t>
+      </w:r>
+      <w:r>
+        <w:t xml:space="preserve">hệ thống lưu yêu cầu ở trạng thái </w:t>
+      </w:r>
+      <w:r>
+        <w:t>“</w:t>
+      </w:r>
+      <w:r>
+        <w:t>Chờ duyệt</w:t>
+      </w:r>
+      <w:r>
+        <w:t>”</w:t>
+      </w:r>
+      <w:r>
+        <w:t>.</w:t>
       </w:r>
     </w:p>
     <w:p>
@@ -17815,7 +18009,7 @@
           <w:b/>
           <w:bCs/>
         </w:rPr>
-        <w:t>REQ-005: Hiển thị biểu đồ tiêu thụ điện/nước</w:t>
+        <w:t>REQ-007: Gửi phản hồi và khiếu nại</w:t>
       </w:r>
     </w:p>
     <w:p>
@@ -17833,7 +18027,7 @@
         <w:t>Phát biểu:</w:t>
       </w:r>
       <w:r>
-        <w:t xml:space="preserve"> Hệ thống phải tổng hợp dữ liệu và hiển thị biểu đồ so sánh mức tiêu thụ 6 tháng liên tiếp.</w:t>
+        <w:t xml:space="preserve"> Hệ thống phải cho phép cư dân gửi phản hồi kèm hình ảnh và cấp mã Ticket tự động để theo dõi.</w:t>
       </w:r>
     </w:p>
     <w:p>
@@ -17851,7 +18045,22 @@
         <w:t>Nguồn:</w:t>
       </w:r>
       <w:r>
-        <w:t xml:space="preserve"> UC-R03</w:t>
+        <w:t xml:space="preserve"> UC-R05</w:t>
+      </w:r>
+    </w:p>
+    <w:p>
+      <w:pPr>
+        <w:numPr>
+          <w:ilvl w:val="0"/>
+          <w:numId w:val="27"/>
+        </w:numPr>
+      </w:pPr>
+      <w:r>
+        <w:rPr>
+          <w:b/>
+          <w:bCs/>
+        </w:rPr>
+        <w:t xml:space="preserve">REQ-008: Nhận thông báo nhắc nợ </w:t>
       </w:r>
     </w:p>
     <w:p>
@@ -17866,51 +18075,16 @@
           <w:b/>
           <w:bCs/>
         </w:rPr>
-        <w:t>Tiêu chí chấp nhận:</w:t>
-      </w:r>
-    </w:p>
-    <w:p>
-      <w:pPr>
-        <w:numPr>
-          <w:ilvl w:val="2"/>
-          <w:numId w:val="27"/>
-        </w:numPr>
-      </w:pPr>
-      <w:r>
-        <w:t>Khi</w:t>
-      </w:r>
-      <w:r>
-        <w:t xml:space="preserve"> có dữ liệu chỉ số của ít nhất 2 tháng</w:t>
-      </w:r>
-      <w:r>
-        <w:t>. Cư</w:t>
-      </w:r>
-      <w:r>
-        <w:t xml:space="preserve"> dân vào mục </w:t>
-      </w:r>
-      <w:r>
-        <w:t>“</w:t>
-      </w:r>
-      <w:r>
-        <w:t>Thống kê</w:t>
-      </w:r>
-      <w:r>
-        <w:t>”</w:t>
-      </w:r>
-      <w:r>
-        <w:t xml:space="preserve">, hệ thống </w:t>
-      </w:r>
-      <w:r>
-        <w:t xml:space="preserve">sẽ </w:t>
-      </w:r>
-      <w:r>
-        <w:t>hiển thị biểu đồ đường thể hiện sự biến động tiêu thụ.</w:t>
-      </w:r>
-    </w:p>
-    <w:p>
-      <w:pPr>
-        <w:numPr>
-          <w:ilvl w:val="0"/>
+        <w:t>Phát biểu:</w:t>
+      </w:r>
+      <w:r>
+        <w:t xml:space="preserve"> Hệ thống phải gửi thông báo tự động tới thiết bị cư dân khi có hóa đơn mới hoặc sắp đến hạn chót.</w:t>
+      </w:r>
+    </w:p>
+    <w:p>
+      <w:pPr>
+        <w:numPr>
+          <w:ilvl w:val="1"/>
           <w:numId w:val="27"/>
         </w:numPr>
       </w:pPr>
@@ -17919,32 +18093,26 @@
           <w:b/>
           <w:bCs/>
         </w:rPr>
-        <w:t>REQ-006: Đăng ký dịch vụ mới</w:t>
-      </w:r>
-    </w:p>
-    <w:p>
-      <w:pPr>
-        <w:numPr>
-          <w:ilvl w:val="1"/>
-          <w:numId w:val="27"/>
-        </w:numPr>
-      </w:pPr>
+        <w:t>Nguồn:</w:t>
+      </w:r>
+      <w:r>
+        <w:t xml:space="preserve"> Sprint 4</w:t>
+      </w:r>
+    </w:p>
+    <w:p>
       <w:r>
         <w:rPr>
           <w:b/>
           <w:bCs/>
         </w:rPr>
-        <w:t>Phát biểu:</w:t>
-      </w:r>
-      <w:r>
-        <w:t xml:space="preserve"> Hệ thống phải cung cấp form đăng ký các dịch vụ chung cư (thẻ xe, thẻ thang máy, sửa chữa).</w:t>
-      </w:r>
-    </w:p>
-    <w:p>
-      <w:pPr>
-        <w:numPr>
-          <w:ilvl w:val="1"/>
-          <w:numId w:val="27"/>
+        <w:t>B. Phân hệ Ban Quản Lý</w:t>
+      </w:r>
+    </w:p>
+    <w:p>
+      <w:pPr>
+        <w:numPr>
+          <w:ilvl w:val="0"/>
+          <w:numId w:val="28"/>
         </w:numPr>
       </w:pPr>
       <w:r>
@@ -17952,17 +18120,14 @@
           <w:b/>
           <w:bCs/>
         </w:rPr>
-        <w:t>Nguồn:</w:t>
-      </w:r>
-      <w:r>
-        <w:t xml:space="preserve"> UC-R04</w:t>
+        <w:t>REQ-009: Quản lý thông tin cư dân</w:t>
       </w:r>
     </w:p>
     <w:p>
       <w:pPr>
         <w:numPr>
           <w:ilvl w:val="1"/>
-          <w:numId w:val="27"/>
+          <w:numId w:val="28"/>
         </w:numPr>
       </w:pPr>
       <w:r>
@@ -17970,64 +18135,17 @@
           <w:b/>
           <w:bCs/>
         </w:rPr>
-        <w:t>Tiêu chí chấp nhận:</w:t>
-      </w:r>
-    </w:p>
-    <w:p>
-      <w:pPr>
-        <w:numPr>
-          <w:ilvl w:val="2"/>
-          <w:numId w:val="27"/>
-        </w:numPr>
-      </w:pPr>
-      <w:r>
-        <w:t>Cư</w:t>
-      </w:r>
-      <w:r>
-        <w:t xml:space="preserve"> dân cần thẻ gửi xe mới, </w:t>
-      </w:r>
-      <w:r>
-        <w:t>sẽ</w:t>
-      </w:r>
-      <w:r>
-        <w:rPr>
-          <w:i/>
-        </w:rPr>
-        <w:t xml:space="preserve"> </w:t>
-      </w:r>
-      <w:r>
-        <w:t xml:space="preserve">điền thông tin và đính kèm ảnh giấy tờ, </w:t>
-      </w:r>
-      <w:r>
-        <w:t>rồi</w:t>
-      </w:r>
-      <w:r>
-        <w:rPr>
-          <w:i/>
-        </w:rPr>
-        <w:t xml:space="preserve"> </w:t>
-      </w:r>
-      <w:r>
-        <w:t xml:space="preserve">hệ thống lưu yêu cầu ở trạng thái </w:t>
-      </w:r>
-      <w:r>
-        <w:t>“</w:t>
-      </w:r>
-      <w:r>
-        <w:t>Chờ duyệt</w:t>
-      </w:r>
-      <w:r>
-        <w:t>”</w:t>
-      </w:r>
-      <w:r>
-        <w:t>.</w:t>
-      </w:r>
-    </w:p>
-    <w:p>
-      <w:pPr>
-        <w:numPr>
-          <w:ilvl w:val="0"/>
-          <w:numId w:val="27"/>
+        <w:t>Phát biểu:</w:t>
+      </w:r>
+      <w:r>
+        <w:t xml:space="preserve"> Hệ thống phải cho phép BQL thêm, sửa, xóa và cập nhật trạng thái cư trú của cư dân theo từng căn hộ.</w:t>
+      </w:r>
+    </w:p>
+    <w:p>
+      <w:pPr>
+        <w:numPr>
+          <w:ilvl w:val="1"/>
+          <w:numId w:val="28"/>
         </w:numPr>
       </w:pPr>
       <w:r>
@@ -18035,14 +18153,17 @@
           <w:b/>
           <w:bCs/>
         </w:rPr>
-        <w:t>REQ-007: Gửi phản hồi và khiếu nại</w:t>
-      </w:r>
-    </w:p>
-    <w:p>
-      <w:pPr>
-        <w:numPr>
-          <w:ilvl w:val="1"/>
-          <w:numId w:val="27"/>
+        <w:t>Nguồn:</w:t>
+      </w:r>
+      <w:r>
+        <w:t xml:space="preserve"> UC-M01</w:t>
+      </w:r>
+    </w:p>
+    <w:p>
+      <w:pPr>
+        <w:numPr>
+          <w:ilvl w:val="0"/>
+          <w:numId w:val="28"/>
         </w:numPr>
       </w:pPr>
       <w:r>
@@ -18050,17 +18171,14 @@
           <w:b/>
           <w:bCs/>
         </w:rPr>
-        <w:t>Phát biểu:</w:t>
-      </w:r>
-      <w:r>
-        <w:t xml:space="preserve"> Hệ thống phải cho phép cư dân gửi phản hồi kèm hình ảnh và cấp mã Ticket tự động để theo dõi.</w:t>
+        <w:t>REQ-010: Ghi nhận chỉ số tiêu thụ định kỳ</w:t>
       </w:r>
     </w:p>
     <w:p>
       <w:pPr>
         <w:numPr>
           <w:ilvl w:val="1"/>
-          <w:numId w:val="27"/>
+          <w:numId w:val="28"/>
         </w:numPr>
       </w:pPr>
       <w:r>
@@ -18068,17 +18186,17 @@
           <w:b/>
           <w:bCs/>
         </w:rPr>
-        <w:t>Nguồn:</w:t>
-      </w:r>
-      <w:r>
-        <w:t xml:space="preserve"> UC-R05</w:t>
-      </w:r>
-    </w:p>
-    <w:p>
-      <w:pPr>
-        <w:numPr>
-          <w:ilvl w:val="0"/>
-          <w:numId w:val="27"/>
+        <w:t>Phát biểu:</w:t>
+      </w:r>
+      <w:r>
+        <w:t xml:space="preserve"> Hệ thống phải cho phép nhân viên BQL nhập chỉ số điện, nước mới cho từng căn hộ theo tháng.</w:t>
+      </w:r>
+    </w:p>
+    <w:p>
+      <w:pPr>
+        <w:numPr>
+          <w:ilvl w:val="1"/>
+          <w:numId w:val="28"/>
         </w:numPr>
       </w:pPr>
       <w:r>
@@ -18086,14 +18204,17 @@
           <w:b/>
           <w:bCs/>
         </w:rPr>
-        <w:t xml:space="preserve">REQ-008: Nhận thông báo nhắc nợ </w:t>
+        <w:t>Nguồn:</w:t>
+      </w:r>
+      <w:r>
+        <w:t xml:space="preserve"> UC-M02 </w:t>
       </w:r>
     </w:p>
     <w:p>
       <w:pPr>
         <w:numPr>
           <w:ilvl w:val="1"/>
-          <w:numId w:val="27"/>
+          <w:numId w:val="28"/>
         </w:numPr>
       </w:pPr>
       <w:r>
@@ -18101,18 +18222,40 @@
           <w:b/>
           <w:bCs/>
         </w:rPr>
-        <w:lastRenderedPageBreak/>
-        <w:t>Phát biểu:</w:t>
-      </w:r>
-      <w:r>
-        <w:t xml:space="preserve"> Hệ thống phải gửi thông báo tự động tới thiết bị cư dân khi có hóa đơn mới hoặc sắp đến hạn chót.</w:t>
-      </w:r>
-    </w:p>
-    <w:p>
-      <w:pPr>
-        <w:numPr>
-          <w:ilvl w:val="1"/>
-          <w:numId w:val="27"/>
+        <w:t>Tiêu chí chấp nhận:</w:t>
+      </w:r>
+    </w:p>
+    <w:p>
+      <w:pPr>
+        <w:numPr>
+          <w:ilvl w:val="2"/>
+          <w:numId w:val="28"/>
+        </w:numPr>
+      </w:pPr>
+      <w:r>
+        <w:t>Khi</w:t>
+      </w:r>
+      <w:r>
+        <w:t xml:space="preserve"> nhân viên nhập số mới, </w:t>
+      </w:r>
+      <w:r>
+        <w:t>nhưng</w:t>
+      </w:r>
+      <w:r>
+        <w:t xml:space="preserve"> số mới thấp hơn số cũ, </w:t>
+      </w:r>
+      <w:r>
+        <w:t>thì</w:t>
+      </w:r>
+      <w:r>
+        <w:t xml:space="preserve"> hệ thống báo lỗi và yêu cầu kiểm tra lại.</w:t>
+      </w:r>
+    </w:p>
+    <w:p>
+      <w:pPr>
+        <w:numPr>
+          <w:ilvl w:val="0"/>
+          <w:numId w:val="28"/>
         </w:numPr>
       </w:pPr>
       <w:r>
@@ -18120,19 +18263,62 @@
           <w:b/>
           <w:bCs/>
         </w:rPr>
-        <w:t>Nguồn:</w:t>
-      </w:r>
-      <w:r>
-        <w:t xml:space="preserve"> Sprint 4</w:t>
-      </w:r>
-    </w:p>
-    <w:p>
+        <w:lastRenderedPageBreak/>
+        <w:t>REQ-011: Tính toán phí tự động</w:t>
+      </w:r>
+    </w:p>
+    <w:p>
+      <w:pPr>
+        <w:numPr>
+          <w:ilvl w:val="1"/>
+          <w:numId w:val="28"/>
+        </w:numPr>
+      </w:pPr>
       <w:r>
         <w:rPr>
           <w:b/>
           <w:bCs/>
         </w:rPr>
-        <w:t>B. Phân hệ Ban Quản Lý</w:t>
+        <w:t>Phát biểu:</w:t>
+      </w:r>
+      <w:r>
+        <w:t xml:space="preserve"> Hệ thống phải tự động tính toán tổng phí dựa trên chỉ số đã nhập và các quy tắc giá lũy tiến.</w:t>
+      </w:r>
+    </w:p>
+    <w:p>
+      <w:pPr>
+        <w:numPr>
+          <w:ilvl w:val="1"/>
+          <w:numId w:val="28"/>
+        </w:numPr>
+      </w:pPr>
+      <w:r>
+        <w:rPr>
+          <w:b/>
+          <w:bCs/>
+        </w:rPr>
+        <w:t>Nguồn:</w:t>
+      </w:r>
+      <w:r>
+        <w:t xml:space="preserve"> UC-M03</w:t>
+      </w:r>
+    </w:p>
+    <w:p>
+      <w:pPr>
+        <w:numPr>
+          <w:ilvl w:val="1"/>
+          <w:numId w:val="28"/>
+        </w:numPr>
+      </w:pPr>
+      <w:r>
+        <w:rPr>
+          <w:b/>
+          <w:bCs/>
+        </w:rPr>
+        <w:t>Quy tắc nghiệp vụ:</w:t>
+      </w:r>
+      <w:r>
+        <w:t xml:space="preserve"> BR-01 (Giá điện theo bậc thang), BR-02 (Giá nước theo định mức).</w:t>
       </w:r>
     </w:p>
     <w:p>
@@ -18147,7 +18333,7 @@
           <w:b/>
           <w:bCs/>
         </w:rPr>
-        <w:t>REQ-009: Quản lý thông tin cư dân</w:t>
+        <w:t>REQ-012: Phê duyệt yêu cầu dịch vụ</w:t>
       </w:r>
     </w:p>
     <w:p>
@@ -18165,7 +18351,7 @@
         <w:t>Phát biểu:</w:t>
       </w:r>
       <w:r>
-        <w:t xml:space="preserve"> Hệ thống phải cho phép BQL thêm, sửa, xóa và cập nhật trạng thái cư trú của cư dân theo từng căn hộ.</w:t>
+        <w:t xml:space="preserve"> Hệ thống phải cho phép BQL duyệt hoặc từ chối các yêu cầu đăng ký dịch vụ/khiếu nại của cư dân.</w:t>
       </w:r>
     </w:p>
     <w:p>
@@ -18183,29 +18369,23 @@
         <w:t>Nguồn:</w:t>
       </w:r>
       <w:r>
-        <w:t xml:space="preserve"> UC-M01</w:t>
-      </w:r>
-    </w:p>
-    <w:p>
-      <w:pPr>
-        <w:numPr>
-          <w:ilvl w:val="0"/>
-          <w:numId w:val="28"/>
-        </w:numPr>
-      </w:pPr>
+        <w:t xml:space="preserve"> UC-R04, UC-R05</w:t>
+      </w:r>
+    </w:p>
+    <w:p>
       <w:r>
         <w:rPr>
           <w:b/>
           <w:bCs/>
         </w:rPr>
-        <w:t>REQ-010: Ghi nhận chỉ số tiêu thụ định kỳ</w:t>
-      </w:r>
-    </w:p>
-    <w:p>
-      <w:pPr>
-        <w:numPr>
-          <w:ilvl w:val="1"/>
-          <w:numId w:val="28"/>
+        <w:t xml:space="preserve">C. Phân hệ Kế toán &amp; Hệ thống </w:t>
+      </w:r>
+    </w:p>
+    <w:p>
+      <w:pPr>
+        <w:numPr>
+          <w:ilvl w:val="0"/>
+          <w:numId w:val="29"/>
         </w:numPr>
       </w:pPr>
       <w:r>
@@ -18213,17 +18393,14 @@
           <w:b/>
           <w:bCs/>
         </w:rPr>
-        <w:t>Phát biểu:</w:t>
-      </w:r>
-      <w:r>
-        <w:t xml:space="preserve"> Hệ thống phải cho phép nhân viên BQL nhập chỉ số điện, nước mới cho từng căn hộ theo tháng.</w:t>
+        <w:t>REQ-013: Xử lý phản hồi từ Cổng thanh toán</w:t>
       </w:r>
     </w:p>
     <w:p>
       <w:pPr>
         <w:numPr>
           <w:ilvl w:val="1"/>
-          <w:numId w:val="28"/>
+          <w:numId w:val="29"/>
         </w:numPr>
       </w:pPr>
       <w:r>
@@ -18231,17 +18408,29 @@
           <w:b/>
           <w:bCs/>
         </w:rPr>
-        <w:t>Nguồn:</w:t>
-      </w:r>
-      <w:r>
-        <w:t xml:space="preserve"> UC-M02 </w:t>
+        <w:t>Phát biểu:</w:t>
+      </w:r>
+      <w:r>
+        <w:t xml:space="preserve"> Hệ thống phải tự động cập nhật trạng thái hóa đơn sang </w:t>
+      </w:r>
+      <w:r>
+        <w:t>“</w:t>
+      </w:r>
+      <w:r>
+        <w:t>Đã thanh toán</w:t>
+      </w:r>
+      <w:r>
+        <w:t>”</w:t>
+      </w:r>
+      <w:r>
+        <w:t xml:space="preserve"> ngay khi nhận được tín hiệu thành công từ đối tác.</w:t>
       </w:r>
     </w:p>
     <w:p>
       <w:pPr>
         <w:numPr>
           <w:ilvl w:val="1"/>
-          <w:numId w:val="28"/>
+          <w:numId w:val="29"/>
         </w:numPr>
       </w:pPr>
       <w:r>
@@ -18249,40 +18438,17 @@
           <w:b/>
           <w:bCs/>
         </w:rPr>
-        <w:t>Tiêu chí chấp nhận:</w:t>
-      </w:r>
-    </w:p>
-    <w:p>
-      <w:pPr>
-        <w:numPr>
-          <w:ilvl w:val="2"/>
-          <w:numId w:val="28"/>
-        </w:numPr>
-      </w:pPr>
-      <w:r>
-        <w:t>Khi</w:t>
-      </w:r>
-      <w:r>
-        <w:t xml:space="preserve"> nhân viên nhập số mới, </w:t>
-      </w:r>
-      <w:r>
-        <w:t>nhưng</w:t>
-      </w:r>
-      <w:r>
-        <w:t xml:space="preserve"> số mới thấp hơn số cũ, </w:t>
-      </w:r>
-      <w:r>
-        <w:t>thì</w:t>
-      </w:r>
-      <w:r>
-        <w:t xml:space="preserve"> hệ thống báo lỗi và yêu cầu kiểm tra lại.</w:t>
+        <w:t>Nguồn:</w:t>
+      </w:r>
+      <w:r>
+        <w:t xml:space="preserve"> UC-A0</w:t>
       </w:r>
     </w:p>
     <w:p>
       <w:pPr>
         <w:numPr>
           <w:ilvl w:val="0"/>
-          <w:numId w:val="28"/>
+          <w:numId w:val="29"/>
         </w:numPr>
       </w:pPr>
       <w:r>
@@ -18290,14 +18456,14 @@
           <w:b/>
           <w:bCs/>
         </w:rPr>
-        <w:t>REQ-011: Tính toán phí tự động</w:t>
+        <w:t>REQ-014: Gạch nợ thủ công</w:t>
       </w:r>
     </w:p>
     <w:p>
       <w:pPr>
         <w:numPr>
           <w:ilvl w:val="1"/>
-          <w:numId w:val="28"/>
+          <w:numId w:val="29"/>
         </w:numPr>
       </w:pPr>
       <w:r>
@@ -18308,14 +18474,26 @@
         <w:t>Phát biểu:</w:t>
       </w:r>
       <w:r>
-        <w:t xml:space="preserve"> Hệ thống phải tự động tính toán tổng phí dựa trên chỉ số đã nhập và các quy tắc giá lũy tiến.</w:t>
+        <w:t xml:space="preserve"> Hệ thống phải cho phép kế toán đánh dấu </w:t>
+      </w:r>
+      <w:r>
+        <w:t>“</w:t>
+      </w:r>
+      <w:r>
+        <w:t>Đã thanh toán</w:t>
+      </w:r>
+      <w:r>
+        <w:t>”</w:t>
+      </w:r>
+      <w:r>
+        <w:t xml:space="preserve"> thủ công cho các trường hợp chuyển khoản trực tiếp hoặc nộp tiền mặt.</w:t>
       </w:r>
     </w:p>
     <w:p>
       <w:pPr>
         <w:numPr>
           <w:ilvl w:val="1"/>
-          <w:numId w:val="28"/>
+          <w:numId w:val="29"/>
         </w:numPr>
       </w:pPr>
       <w:r>
@@ -18326,14 +18504,14 @@
         <w:t>Nguồn:</w:t>
       </w:r>
       <w:r>
-        <w:t xml:space="preserve"> UC-M03</w:t>
-      </w:r>
-    </w:p>
-    <w:p>
-      <w:pPr>
-        <w:numPr>
-          <w:ilvl w:val="1"/>
-          <w:numId w:val="28"/>
+        <w:t xml:space="preserve"> RSK-01</w:t>
+      </w:r>
+    </w:p>
+    <w:p>
+      <w:pPr>
+        <w:numPr>
+          <w:ilvl w:val="0"/>
+          <w:numId w:val="29"/>
         </w:numPr>
       </w:pPr>
       <w:r>
@@ -18341,17 +18519,14 @@
           <w:b/>
           <w:bCs/>
         </w:rPr>
-        <w:t>Quy tắc nghiệp vụ:</w:t>
-      </w:r>
-      <w:r>
-        <w:t xml:space="preserve"> BR-01 (Giá điện theo bậc thang), BR-02 (Giá nước theo định mức).</w:t>
-      </w:r>
-    </w:p>
-    <w:p>
-      <w:pPr>
-        <w:numPr>
-          <w:ilvl w:val="0"/>
-          <w:numId w:val="28"/>
+        <w:t>REQ-015: Đối soát cuối ngày</w:t>
+      </w:r>
+    </w:p>
+    <w:p>
+      <w:pPr>
+        <w:numPr>
+          <w:ilvl w:val="1"/>
+          <w:numId w:val="29"/>
         </w:numPr>
       </w:pPr>
       <w:r>
@@ -18359,14 +18534,17 @@
           <w:b/>
           <w:bCs/>
         </w:rPr>
-        <w:t>REQ-012: Phê duyệt yêu cầu dịch vụ</w:t>
+        <w:t>Phát biểu:</w:t>
+      </w:r>
+      <w:r>
+        <w:t xml:space="preserve"> Hệ thống phải cung cấp báo cáo đối soát tổng tiền nhận được trên hệ thống so với số dư thực tế tại cổng thanh toán.</w:t>
       </w:r>
     </w:p>
     <w:p>
       <w:pPr>
         <w:numPr>
           <w:ilvl w:val="1"/>
-          <w:numId w:val="28"/>
+          <w:numId w:val="29"/>
         </w:numPr>
       </w:pPr>
       <w:r>
@@ -18374,17 +18552,17 @@
           <w:b/>
           <w:bCs/>
         </w:rPr>
-        <w:t>Phát biểu:</w:t>
-      </w:r>
-      <w:r>
-        <w:t xml:space="preserve"> Hệ thống phải cho phép BQL duyệt hoặc từ chối các yêu cầu đăng ký dịch vụ/khiếu nại của cư dân.</w:t>
-      </w:r>
-    </w:p>
-    <w:p>
-      <w:pPr>
-        <w:numPr>
-          <w:ilvl w:val="1"/>
-          <w:numId w:val="28"/>
+        <w:t>Nguồn:</w:t>
+      </w:r>
+      <w:r>
+        <w:t xml:space="preserve"> UC-A01</w:t>
+      </w:r>
+    </w:p>
+    <w:p>
+      <w:pPr>
+        <w:numPr>
+          <w:ilvl w:val="0"/>
+          <w:numId w:val="29"/>
         </w:numPr>
       </w:pPr>
       <w:r>
@@ -18392,25 +18570,31 @@
           <w:b/>
           <w:bCs/>
         </w:rPr>
-        <w:t>Nguồn:</w:t>
-      </w:r>
-      <w:r>
-        <w:t xml:space="preserve"> UC-R04, UC-R05</w:t>
-      </w:r>
-    </w:p>
-    <w:p>
+        <w:t>REQ-016: Cơ chế Retry Webhook</w:t>
+      </w:r>
+    </w:p>
+    <w:p>
+      <w:pPr>
+        <w:numPr>
+          <w:ilvl w:val="1"/>
+          <w:numId w:val="29"/>
+        </w:numPr>
+      </w:pPr>
       <w:r>
         <w:rPr>
           <w:b/>
           <w:bCs/>
         </w:rPr>
-        <w:t xml:space="preserve">C. Phân hệ Kế toán &amp; Hệ thống </w:t>
-      </w:r>
-    </w:p>
-    <w:p>
-      <w:pPr>
-        <w:numPr>
-          <w:ilvl w:val="0"/>
+        <w:t>Phát biểu:</w:t>
+      </w:r>
+      <w:r>
+        <w:t xml:space="preserve"> Hệ thống phải tự động gọi lại API cập nhật trạng thái nếu lần đầu xử lý bị lỗi do mạng.</w:t>
+      </w:r>
+    </w:p>
+    <w:p>
+      <w:pPr>
+        <w:numPr>
+          <w:ilvl w:val="1"/>
           <w:numId w:val="29"/>
         </w:numPr>
       </w:pPr>
@@ -18419,232 +18603,22 @@
           <w:b/>
           <w:bCs/>
         </w:rPr>
-        <w:t>REQ-013: Xử lý phản hồi từ Cổng thanh toán</w:t>
-      </w:r>
-    </w:p>
-    <w:p>
-      <w:pPr>
-        <w:numPr>
-          <w:ilvl w:val="1"/>
-          <w:numId w:val="29"/>
-        </w:numPr>
-      </w:pPr>
-      <w:r>
-        <w:rPr>
-          <w:b/>
-          <w:bCs/>
-        </w:rPr>
-        <w:t>Phát biểu:</w:t>
-      </w:r>
-      <w:r>
-        <w:t xml:space="preserve"> Hệ thống phải tự động cập nhật trạng thái hóa đơn sang </w:t>
-      </w:r>
-      <w:r>
-        <w:t>“</w:t>
-      </w:r>
-      <w:r>
-        <w:t>Đã thanh toán</w:t>
-      </w:r>
-      <w:r>
-        <w:t>”</w:t>
-      </w:r>
-      <w:r>
-        <w:t xml:space="preserve"> ngay khi nhận được tín hiệu thành công từ đối tác.</w:t>
-      </w:r>
-    </w:p>
-    <w:p>
-      <w:pPr>
-        <w:numPr>
-          <w:ilvl w:val="1"/>
-          <w:numId w:val="29"/>
-        </w:numPr>
-      </w:pPr>
-      <w:r>
-        <w:rPr>
-          <w:b/>
-          <w:bCs/>
-        </w:rPr>
         <w:t>Nguồn:</w:t>
       </w:r>
       <w:r>
-        <w:t xml:space="preserve"> UC-A0</w:t>
-      </w:r>
-    </w:p>
-    <w:p>
-      <w:pPr>
-        <w:numPr>
-          <w:ilvl w:val="0"/>
-          <w:numId w:val="29"/>
-        </w:numPr>
-      </w:pPr>
-      <w:r>
-        <w:rPr>
-          <w:b/>
-          <w:bCs/>
-        </w:rPr>
+        <w:t xml:space="preserve"> RSK-01</w:t>
+      </w:r>
+    </w:p>
+    <w:p>
+      <w:pPr>
+        <w:pStyle w:val="Heading3"/>
+      </w:pPr>
+      <w:bookmarkStart w:id="59" w:name="_Toc227612297"/>
+      <w:r>
         <w:lastRenderedPageBreak/>
-        <w:t>REQ-014: Gạch nợ thủ công</w:t>
-      </w:r>
-    </w:p>
-    <w:p>
-      <w:pPr>
-        <w:numPr>
-          <w:ilvl w:val="1"/>
-          <w:numId w:val="29"/>
-        </w:numPr>
-      </w:pPr>
-      <w:r>
-        <w:rPr>
-          <w:b/>
-          <w:bCs/>
-        </w:rPr>
-        <w:t>Phát biểu:</w:t>
-      </w:r>
-      <w:r>
-        <w:t xml:space="preserve"> Hệ thống phải cho phép kế toán đánh dấu </w:t>
-      </w:r>
-      <w:r>
-        <w:t>“</w:t>
-      </w:r>
-      <w:r>
-        <w:t>Đã thanh toán</w:t>
-      </w:r>
-      <w:r>
-        <w:t>”</w:t>
-      </w:r>
-      <w:r>
-        <w:t xml:space="preserve"> thủ công cho các trường hợp chuyển khoản trực tiếp hoặc nộp tiền mặt.</w:t>
-      </w:r>
-    </w:p>
-    <w:p>
-      <w:pPr>
-        <w:numPr>
-          <w:ilvl w:val="1"/>
-          <w:numId w:val="29"/>
-        </w:numPr>
-      </w:pPr>
-      <w:r>
-        <w:rPr>
-          <w:b/>
-          <w:bCs/>
-        </w:rPr>
-        <w:t>Nguồn:</w:t>
-      </w:r>
-      <w:r>
-        <w:t xml:space="preserve"> RSK-01</w:t>
-      </w:r>
-    </w:p>
-    <w:p>
-      <w:pPr>
-        <w:numPr>
-          <w:ilvl w:val="0"/>
-          <w:numId w:val="29"/>
-        </w:numPr>
-      </w:pPr>
-      <w:r>
-        <w:rPr>
-          <w:b/>
-          <w:bCs/>
-        </w:rPr>
-        <w:t>REQ-015: Đối soát cuối ngày</w:t>
-      </w:r>
-    </w:p>
-    <w:p>
-      <w:pPr>
-        <w:numPr>
-          <w:ilvl w:val="1"/>
-          <w:numId w:val="29"/>
-        </w:numPr>
-      </w:pPr>
-      <w:r>
-        <w:rPr>
-          <w:b/>
-          <w:bCs/>
-        </w:rPr>
-        <w:t>Phát biểu:</w:t>
-      </w:r>
-      <w:r>
-        <w:t xml:space="preserve"> Hệ thống phải cung cấp báo cáo đối soát tổng tiền nhận được trên hệ thống so với số dư thực tế tại cổng thanh toán.</w:t>
-      </w:r>
-    </w:p>
-    <w:p>
-      <w:pPr>
-        <w:numPr>
-          <w:ilvl w:val="1"/>
-          <w:numId w:val="29"/>
-        </w:numPr>
-      </w:pPr>
-      <w:r>
-        <w:rPr>
-          <w:b/>
-          <w:bCs/>
-        </w:rPr>
-        <w:t>Nguồn:</w:t>
-      </w:r>
-      <w:r>
-        <w:t xml:space="preserve"> UC-A01</w:t>
-      </w:r>
-    </w:p>
-    <w:p>
-      <w:pPr>
-        <w:numPr>
-          <w:ilvl w:val="0"/>
-          <w:numId w:val="29"/>
-        </w:numPr>
-      </w:pPr>
-      <w:r>
-        <w:rPr>
-          <w:b/>
-          <w:bCs/>
-        </w:rPr>
-        <w:t>REQ-016: Cơ chế Retry Webhook</w:t>
-      </w:r>
-    </w:p>
-    <w:p>
-      <w:pPr>
-        <w:numPr>
-          <w:ilvl w:val="1"/>
-          <w:numId w:val="29"/>
-        </w:numPr>
-      </w:pPr>
-      <w:r>
-        <w:rPr>
-          <w:b/>
-          <w:bCs/>
-        </w:rPr>
-        <w:t>Phát biểu:</w:t>
-      </w:r>
-      <w:r>
-        <w:t xml:space="preserve"> Hệ thống phải tự động gọi lại API cập nhật trạng thái nếu lần đầu xử lý bị lỗi do mạng.</w:t>
-      </w:r>
-    </w:p>
-    <w:p>
-      <w:pPr>
-        <w:numPr>
-          <w:ilvl w:val="1"/>
-          <w:numId w:val="29"/>
-        </w:numPr>
-      </w:pPr>
-      <w:r>
-        <w:rPr>
-          <w:b/>
-          <w:bCs/>
-        </w:rPr>
-        <w:t>Nguồn:</w:t>
-      </w:r>
-      <w:r>
-        <w:t xml:space="preserve"> RSK-01</w:t>
-      </w:r>
-    </w:p>
-    <w:p>
-      <w:pPr>
-        <w:pStyle w:val="Heading3"/>
-      </w:pPr>
-      <w:bookmarkStart w:id="60" w:name="_Toc227612297"/>
-      <w:r>
         <w:t>3.1.2 Ma trận CRUD hệ thống</w:t>
       </w:r>
-      <w:bookmarkEnd w:id="60"/>
+      <w:bookmarkEnd w:id="59"/>
       <w:r>
         <w:t xml:space="preserve"> </w:t>
       </w:r>
@@ -19312,11 +19286,11 @@
       <w:pPr>
         <w:pStyle w:val="Heading3"/>
       </w:pPr>
-      <w:bookmarkStart w:id="61" w:name="_Toc227612298"/>
+      <w:bookmarkStart w:id="60" w:name="_Toc227612298"/>
       <w:r>
         <w:t>3.1.3 Ma trận Khả năng Truy xuất</w:t>
       </w:r>
-      <w:bookmarkEnd w:id="61"/>
+      <w:bookmarkEnd w:id="60"/>
     </w:p>
     <w:tbl>
       <w:tblPr>
@@ -19487,7 +19461,6 @@
               <w:jc w:val="center"/>
             </w:pPr>
             <w:r>
-              <w:lastRenderedPageBreak/>
               <w:t>REQ-003</w:t>
             </w:r>
           </w:p>
@@ -19759,11 +19732,11 @@
       <w:pPr>
         <w:pStyle w:val="Heading2"/>
       </w:pPr>
-      <w:bookmarkStart w:id="62" w:name="_Toc227612299"/>
+      <w:bookmarkStart w:id="61" w:name="_Toc227612299"/>
       <w:r>
         <w:t>3.2 ĐẶC TẢ YÊU CẦU PHI CHỨC NĂNG</w:t>
       </w:r>
-      <w:bookmarkEnd w:id="62"/>
+      <w:bookmarkEnd w:id="61"/>
     </w:p>
     <w:p>
       <w:r>
@@ -19781,14 +19754,14 @@
       <w:pPr>
         <w:pStyle w:val="Heading3"/>
       </w:pPr>
-      <w:bookmarkStart w:id="63" w:name="_Toc227612300"/>
+      <w:bookmarkStart w:id="62" w:name="_Toc227612300"/>
       <w:r>
         <w:t>3.2.1</w:t>
       </w:r>
       <w:r>
         <w:t xml:space="preserve"> Hiệu năng và Khả năng mở rộng</w:t>
       </w:r>
-      <w:bookmarkEnd w:id="63"/>
+      <w:bookmarkEnd w:id="62"/>
       <w:r>
         <w:t xml:space="preserve"> </w:t>
       </w:r>
@@ -19865,8 +19838,9 @@
       <w:pPr>
         <w:pStyle w:val="Heading3"/>
       </w:pPr>
-      <w:bookmarkStart w:id="64" w:name="_Toc227612301"/>
-      <w:r>
+      <w:bookmarkStart w:id="63" w:name="_Toc227612301"/>
+      <w:r>
+        <w:lastRenderedPageBreak/>
         <w:t>3.</w:t>
       </w:r>
       <w:r>
@@ -19878,7 +19852,7 @@
       <w:r>
         <w:t xml:space="preserve"> Bảo mật</w:t>
       </w:r>
-      <w:bookmarkEnd w:id="64"/>
+      <w:bookmarkEnd w:id="63"/>
       <w:r>
         <w:t xml:space="preserve"> </w:t>
       </w:r>
@@ -19937,7 +19911,7 @@
       <w:pPr>
         <w:pStyle w:val="Heading3"/>
       </w:pPr>
-      <w:bookmarkStart w:id="65" w:name="_Toc227612302"/>
+      <w:bookmarkStart w:id="64" w:name="_Toc227612302"/>
       <w:r>
         <w:t>3.</w:t>
       </w:r>
@@ -19950,7 +19924,7 @@
       <w:r>
         <w:t xml:space="preserve"> Độ sẵn sàng và Tin cậy</w:t>
       </w:r>
-      <w:bookmarkEnd w:id="65"/>
+      <w:bookmarkEnd w:id="64"/>
       <w:r>
         <w:t xml:space="preserve"> </w:t>
       </w:r>
@@ -20018,7 +19992,7 @@
       <w:pPr>
         <w:pStyle w:val="Heading3"/>
       </w:pPr>
-      <w:bookmarkStart w:id="66" w:name="_Toc227612303"/>
+      <w:bookmarkStart w:id="65" w:name="_Toc227612303"/>
       <w:r>
         <w:t>3.2.</w:t>
       </w:r>
@@ -20028,7 +20002,7 @@
       <w:r>
         <w:t xml:space="preserve"> Tính khả dụng và Tiếp cận</w:t>
       </w:r>
-      <w:bookmarkEnd w:id="66"/>
+      <w:bookmarkEnd w:id="65"/>
     </w:p>
     <w:p>
       <w:pPr>
@@ -20102,15 +20076,14 @@
       <w:pPr>
         <w:pStyle w:val="Heading3"/>
       </w:pPr>
-      <w:bookmarkStart w:id="67" w:name="_Toc227612304"/>
-      <w:r>
-        <w:lastRenderedPageBreak/>
+      <w:bookmarkStart w:id="66" w:name="_Toc227612304"/>
+      <w:r>
         <w:t>3.2.</w:t>
       </w:r>
       <w:r>
         <w:t>5 Ràng buộc và Bảo trì</w:t>
       </w:r>
-      <w:bookmarkEnd w:id="67"/>
+      <w:bookmarkEnd w:id="66"/>
     </w:p>
     <w:p>
       <w:pPr>
@@ -20166,7 +20139,7 @@
       <w:pPr>
         <w:pStyle w:val="Heading2"/>
       </w:pPr>
-      <w:bookmarkStart w:id="68" w:name="_Toc227612305"/>
+      <w:bookmarkStart w:id="67" w:name="_Toc227612305"/>
       <w:r>
         <w:t>3.</w:t>
       </w:r>
@@ -20176,44 +20149,44 @@
       <w:r>
         <w:t xml:space="preserve"> TÀI LIỆU WIREFRAMES UI VÀ LUỒNG ĐIỀU HƯỚNG</w:t>
       </w:r>
+      <w:bookmarkEnd w:id="67"/>
+    </w:p>
+    <w:p>
+      <w:r>
+        <w:t>Tài liệu thiết kế giao diện này bám sát các luồng Use-case đã vạch ra nhằm đảm bảo tính khả dụng cao nhất cho 3 nhóm Persona chính: Cư dân, Nhân viên BQL và Kế toán.</w:t>
+      </w:r>
+    </w:p>
+    <w:p>
+      <w:pPr>
+        <w:pStyle w:val="Heading3"/>
+      </w:pPr>
+      <w:bookmarkStart w:id="68" w:name="_Toc227612306"/>
+      <w:commentRangeStart w:id="69"/>
+      <w:commentRangeStart w:id="70"/>
+      <w:r>
+        <w:t>3.3</w:t>
+      </w:r>
+      <w:r>
+        <w:t>.1 Cấu trúc Wireframes chi tiết các màn hình cốt lõi</w:t>
+      </w:r>
       <w:bookmarkEnd w:id="68"/>
-    </w:p>
-    <w:p>
-      <w:r>
-        <w:t>Tài liệu thiết kế giao diện này bám sát các luồng Use-case đã vạch ra nhằm đảm bảo tính khả dụng cao nhất cho 3 nhóm Persona chính: Cư dân, Nhân viên BQL và Kế toán.</w:t>
-      </w:r>
-    </w:p>
-    <w:p>
-      <w:pPr>
-        <w:pStyle w:val="Heading3"/>
-      </w:pPr>
-      <w:bookmarkStart w:id="69" w:name="_Toc227612306"/>
-      <w:commentRangeStart w:id="70"/>
-      <w:commentRangeStart w:id="71"/>
-      <w:r>
-        <w:t>3.3</w:t>
-      </w:r>
-      <w:r>
-        <w:t>.1 Cấu trúc Wireframes chi tiết các màn hình cốt lõi</w:t>
-      </w:r>
-      <w:bookmarkEnd w:id="69"/>
-      <w:commentRangeEnd w:id="70"/>
+      <w:commentRangeEnd w:id="69"/>
       <w:r>
         <w:rPr>
           <w:rStyle w:val="CommentReference"/>
           <w:sz w:val="28"/>
           <w:szCs w:val="35"/>
         </w:rPr>
-        <w:commentReference w:id="70"/>
-      </w:r>
-      <w:commentRangeEnd w:id="71"/>
+        <w:commentReference w:id="69"/>
+      </w:r>
+      <w:commentRangeEnd w:id="70"/>
       <w:r>
         <w:rPr>
           <w:rStyle w:val="CommentReference"/>
           <w:sz w:val="28"/>
           <w:szCs w:val="35"/>
         </w:rPr>
-        <w:commentReference w:id="71"/>
+        <w:commentReference w:id="70"/>
       </w:r>
     </w:p>
     <w:p>
@@ -20273,6 +20246,7 @@
         <w:rPr>
           <w:noProof/>
         </w:rPr>
+        <w:lastRenderedPageBreak/>
         <w:drawing>
           <wp:inline distT="0" distB="0" distL="0" distR="0" wp14:anchorId="7FBF8FBA" wp14:editId="72F9D851">
             <wp:extent cx="5067561" cy="3873699"/>
@@ -20289,7 +20263,7 @@
                     <pic:cNvPicPr/>
                   </pic:nvPicPr>
                   <pic:blipFill>
-                    <a:blip r:embed="rId19">
+                    <a:blip r:embed="rId20">
                       <a:extLst>
                         <a:ext uri="{28A0092B-C50C-407E-A947-70E740481C1C}">
                           <a14:useLocalDpi xmlns:a14="http://schemas.microsoft.com/office/drawing/2010/main"/>
@@ -20320,7 +20294,7 @@
       <w:pPr>
         <w:pStyle w:val="Caption"/>
       </w:pPr>
-      <w:bookmarkStart w:id="72" w:name="_Toc227740225"/>
+      <w:bookmarkStart w:id="71" w:name="_Toc227740225"/>
       <w:r>
         <w:t xml:space="preserve">Hình </w:t>
       </w:r>
@@ -20345,7 +20319,7 @@
       <w:r>
         <w:t xml:space="preserve"> WireFrame Login</w:t>
       </w:r>
-      <w:bookmarkEnd w:id="72"/>
+      <w:bookmarkEnd w:id="71"/>
     </w:p>
     <w:p>
       <w:pPr>
@@ -20461,7 +20435,7 @@
                     <pic:cNvPicPr/>
                   </pic:nvPicPr>
                   <pic:blipFill>
-                    <a:blip r:embed="rId20">
+                    <a:blip r:embed="rId21">
                       <a:extLst>
                         <a:ext uri="{28A0092B-C50C-407E-A947-70E740481C1C}">
                           <a14:useLocalDpi xmlns:a14="http://schemas.microsoft.com/office/drawing/2010/main"/>
@@ -20492,7 +20466,7 @@
       <w:pPr>
         <w:pStyle w:val="Caption"/>
       </w:pPr>
-      <w:bookmarkStart w:id="73" w:name="_Toc227740226"/>
+      <w:bookmarkStart w:id="72" w:name="_Toc227740226"/>
       <w:r>
         <w:t xml:space="preserve">Hình </w:t>
       </w:r>
@@ -20517,7 +20491,7 @@
       <w:r>
         <w:t xml:space="preserve"> WireFrame Hone</w:t>
       </w:r>
-      <w:bookmarkEnd w:id="73"/>
+      <w:bookmarkEnd w:id="72"/>
     </w:p>
     <w:p>
       <w:pPr>
@@ -20639,7 +20613,7 @@
                     <pic:cNvPicPr/>
                   </pic:nvPicPr>
                   <pic:blipFill>
-                    <a:blip r:embed="rId21">
+                    <a:blip r:embed="rId22">
                       <a:extLst>
                         <a:ext uri="{28A0092B-C50C-407E-A947-70E740481C1C}">
                           <a14:useLocalDpi xmlns:a14="http://schemas.microsoft.com/office/drawing/2010/main"/>
@@ -20671,7 +20645,7 @@
         <w:pStyle w:val="Caption"/>
         <w:ind w:left="360"/>
       </w:pPr>
-      <w:bookmarkStart w:id="74" w:name="_Toc227740227"/>
+      <w:bookmarkStart w:id="73" w:name="_Toc227740227"/>
       <w:r>
         <w:t xml:space="preserve">Hình </w:t>
       </w:r>
@@ -20699,7 +20673,7 @@
       <w:r>
         <w:t>WireFrame Invoice details</w:t>
       </w:r>
-      <w:bookmarkEnd w:id="74"/>
+      <w:bookmarkEnd w:id="73"/>
     </w:p>
     <w:p>
       <w:pPr>
@@ -20785,7 +20759,7 @@
                     <pic:cNvPicPr/>
                   </pic:nvPicPr>
                   <pic:blipFill>
-                    <a:blip r:embed="rId22">
+                    <a:blip r:embed="rId23">
                       <a:extLst>
                         <a:ext uri="{28A0092B-C50C-407E-A947-70E740481C1C}">
                           <a14:useLocalDpi xmlns:a14="http://schemas.microsoft.com/office/drawing/2010/main"/>
@@ -20817,7 +20791,7 @@
         <w:pStyle w:val="Caption"/>
         <w:ind w:left="360"/>
       </w:pPr>
-      <w:bookmarkStart w:id="75" w:name="_Toc227740228"/>
+      <w:bookmarkStart w:id="74" w:name="_Toc227740228"/>
       <w:r>
         <w:t xml:space="preserve">Hình </w:t>
       </w:r>
@@ -20845,7 +20819,7 @@
       <w:r>
         <w:t xml:space="preserve"> History and Stats</w:t>
       </w:r>
-      <w:bookmarkEnd w:id="75"/>
+      <w:bookmarkEnd w:id="74"/>
     </w:p>
     <w:p>
       <w:pPr>
@@ -20938,7 +20912,7 @@
                     <pic:cNvPicPr/>
                   </pic:nvPicPr>
                   <pic:blipFill>
-                    <a:blip r:embed="rId23">
+                    <a:blip r:embed="rId24">
                       <a:extLst>
                         <a:ext uri="{28A0092B-C50C-407E-A947-70E740481C1C}">
                           <a14:useLocalDpi xmlns:a14="http://schemas.microsoft.com/office/drawing/2010/main"/>
@@ -20969,7 +20943,7 @@
       <w:pPr>
         <w:pStyle w:val="Caption"/>
       </w:pPr>
-      <w:bookmarkStart w:id="76" w:name="_Toc227740229"/>
+      <w:bookmarkStart w:id="75" w:name="_Toc227740229"/>
       <w:r>
         <w:t xml:space="preserve">Hình </w:t>
       </w:r>
@@ -20997,7 +20971,7 @@
       <w:r>
         <w:t xml:space="preserve"> Request and Complaints</w:t>
       </w:r>
-      <w:bookmarkEnd w:id="76"/>
+      <w:bookmarkEnd w:id="75"/>
     </w:p>
     <w:p>
       <w:pPr>
@@ -21155,7 +21129,7 @@
                     <pic:cNvPicPr/>
                   </pic:nvPicPr>
                   <pic:blipFill>
-                    <a:blip r:embed="rId24">
+                    <a:blip r:embed="rId25">
                       <a:extLst>
                         <a:ext uri="{28A0092B-C50C-407E-A947-70E740481C1C}">
                           <a14:useLocalDpi xmlns:a14="http://schemas.microsoft.com/office/drawing/2010/main"/>
@@ -21187,7 +21161,7 @@
         <w:pStyle w:val="Caption"/>
         <w:ind w:left="360"/>
       </w:pPr>
-      <w:bookmarkStart w:id="77" w:name="_Toc227740230"/>
+      <w:bookmarkStart w:id="76" w:name="_Toc227740230"/>
       <w:r>
         <w:t xml:space="preserve">Hình </w:t>
       </w:r>
@@ -21215,7 +21189,7 @@
       <w:r>
         <w:t xml:space="preserve"> Nhập chỉ số ban quản lý</w:t>
       </w:r>
-      <w:bookmarkEnd w:id="77"/>
+      <w:bookmarkEnd w:id="76"/>
     </w:p>
     <w:p>
       <w:pPr>
@@ -21313,7 +21287,7 @@
                     <pic:cNvPicPr/>
                   </pic:nvPicPr>
                   <pic:blipFill>
-                    <a:blip r:embed="rId25">
+                    <a:blip r:embed="rId26">
                       <a:extLst>
                         <a:ext uri="{28A0092B-C50C-407E-A947-70E740481C1C}">
                           <a14:useLocalDpi xmlns:a14="http://schemas.microsoft.com/office/drawing/2010/main"/>
@@ -21344,7 +21318,7 @@
       <w:pPr>
         <w:pStyle w:val="Caption"/>
       </w:pPr>
-      <w:bookmarkStart w:id="78" w:name="_Toc227740231"/>
+      <w:bookmarkStart w:id="77" w:name="_Toc227740231"/>
       <w:r>
         <w:t xml:space="preserve">Hình </w:t>
       </w:r>
@@ -21372,7 +21346,7 @@
       <w:r>
         <w:t xml:space="preserve"> Quản lý hóa đơn</w:t>
       </w:r>
-      <w:bookmarkEnd w:id="78"/>
+      <w:bookmarkEnd w:id="77"/>
     </w:p>
     <w:p>
       <w:pPr>
@@ -21481,7 +21455,7 @@
                     <pic:cNvPicPr/>
                   </pic:nvPicPr>
                   <pic:blipFill>
-                    <a:blip r:embed="rId26">
+                    <a:blip r:embed="rId27">
                       <a:extLst>
                         <a:ext uri="{28A0092B-C50C-407E-A947-70E740481C1C}">
                           <a14:useLocalDpi xmlns:a14="http://schemas.microsoft.com/office/drawing/2010/main"/>
@@ -21512,7 +21486,7 @@
       <w:pPr>
         <w:pStyle w:val="Caption"/>
       </w:pPr>
-      <w:bookmarkStart w:id="79" w:name="_Toc227740232"/>
+      <w:bookmarkStart w:id="78" w:name="_Toc227740232"/>
       <w:r>
         <w:t xml:space="preserve">Hình </w:t>
       </w:r>
@@ -21540,7 +21514,7 @@
       <w:r>
         <w:t xml:space="preserve"> Đối soát dòng tiền kế toán</w:t>
       </w:r>
-      <w:bookmarkEnd w:id="79"/>
+      <w:bookmarkEnd w:id="78"/>
     </w:p>
     <w:p>
       <w:pPr>
@@ -21561,7 +21535,7 @@
           <w:szCs w:val="35"/>
         </w:rPr>
       </w:pPr>
-      <w:bookmarkStart w:id="80" w:name="_Toc227612307"/>
+      <w:bookmarkStart w:id="79" w:name="_Toc227612307"/>
       <w:r>
         <w:br w:type="page"/>
       </w:r>
@@ -21570,20 +21544,20 @@
       <w:pPr>
         <w:pStyle w:val="Heading3"/>
       </w:pPr>
-      <w:commentRangeStart w:id="81"/>
+      <w:commentRangeStart w:id="80"/>
       <w:r>
         <w:lastRenderedPageBreak/>
         <w:t>3.3.2 Sơ đồ Luồng Điều Hướng (User Flows)</w:t>
       </w:r>
-      <w:bookmarkEnd w:id="80"/>
-      <w:commentRangeEnd w:id="81"/>
+      <w:bookmarkEnd w:id="79"/>
+      <w:commentRangeEnd w:id="80"/>
       <w:r>
         <w:rPr>
           <w:rStyle w:val="CommentReference"/>
           <w:sz w:val="28"/>
           <w:szCs w:val="35"/>
         </w:rPr>
-        <w:commentReference w:id="81"/>
+        <w:commentReference w:id="80"/>
       </w:r>
     </w:p>
     <w:p>
@@ -21592,7 +21566,7 @@
       </w:r>
     </w:p>
     <w:p>
-      <w:commentRangeStart w:id="82"/>
+      <w:commentRangeStart w:id="81"/>
       <w:r>
         <w:rPr>
           <w:rFonts w:ascii="Calibri Light" w:eastAsia="Calibri Light" w:hAnsi="Calibri Light" w:cs="Calibri Light"/>
@@ -22014,61 +21988,61 @@
           <v:rect id="_x0000_i1034" style="width:0;height:1.5pt" o:hralign="center" o:hrstd="t" o:hrnoshade="t" o:hr="t" fillcolor="gray" stroked="f"/>
         </w:pict>
       </w:r>
-      <w:commentRangeEnd w:id="82"/>
+      <w:commentRangeEnd w:id="81"/>
       <w:r>
         <w:rPr>
           <w:rStyle w:val="CommentReference"/>
           <w:sz w:val="28"/>
           <w:szCs w:val="28"/>
         </w:rPr>
-        <w:commentReference w:id="82"/>
+        <w:commentReference w:id="81"/>
       </w:r>
     </w:p>
     <w:p>
       <w:pPr>
         <w:pStyle w:val="Heading1"/>
       </w:pPr>
-      <w:bookmarkStart w:id="83" w:name="_Toc227612308"/>
+      <w:bookmarkStart w:id="82" w:name="_Toc227612308"/>
       <w:r>
         <w:lastRenderedPageBreak/>
         <w:t>Tuần 4: ĐỊNH NGHĨA KIẾN TRÚC HỆ THỐNG</w:t>
       </w:r>
+      <w:bookmarkEnd w:id="82"/>
+    </w:p>
+    <w:p>
+      <w:pPr>
+        <w:pStyle w:val="Heading2"/>
+      </w:pPr>
+      <w:bookmarkStart w:id="83" w:name="_Toc227612309"/>
+      <w:r>
+        <w:t>4.1 TÀI LIỆU CÁC YẾU TỐ KIẾN TRÚC (ARCHITECTURAL DRIVERS)</w:t>
+      </w:r>
       <w:bookmarkEnd w:id="83"/>
     </w:p>
     <w:p>
       <w:pPr>
-        <w:pStyle w:val="Heading2"/>
-      </w:pPr>
-      <w:bookmarkStart w:id="84" w:name="_Toc227612309"/>
-      <w:r>
-        <w:t>4.1 TÀI LIỆU CÁC YẾU TỐ KIẾN TRÚC (ARCHITECTURAL DRIVERS)</w:t>
+        <w:pStyle w:val="Heading3"/>
+      </w:pPr>
+      <w:bookmarkStart w:id="84" w:name="_Toc227612310"/>
+      <w:r>
+        <w:t>4.1.1 Tóm tắt các yếu tố cốt lõi (Executive Summary)</w:t>
       </w:r>
       <w:bookmarkEnd w:id="84"/>
     </w:p>
     <w:p>
+      <w:r>
+        <w:t>Hệ thống SmartFee Apartment được định hướng phát triển theo mô hình Web-only nhằm tối ưu hóa nguồn lực và thời gian triển khai. Yếu tố cốt lõi định hình kiến trúc là khả năng xử lý nghiệp vụ tài chính đồng loạt (batch processing), tính bảo mật và khả năng thích ứng màn hình đa thiết bị (Responsive) để cư dân sử dụng trên điện thoại di động mượt mà như một ứng dụng gốc (Native App).</w:t>
+      </w:r>
+    </w:p>
+    <w:p>
       <w:pPr>
         <w:pStyle w:val="Heading3"/>
       </w:pPr>
-      <w:bookmarkStart w:id="85" w:name="_Toc227612310"/>
-      <w:r>
-        <w:t>4.1.1 Tóm tắt các yếu tố cốt lõi (Executive Summary)</w:t>
+      <w:bookmarkStart w:id="85" w:name="_Toc227612311"/>
+      <w:r>
+        <w:t>4.1.2 Yêu cầu chức năng ảnh hưởng kiến trúc (ASFRs)</w:t>
       </w:r>
       <w:bookmarkEnd w:id="85"/>
-    </w:p>
-    <w:p>
-      <w:r>
-        <w:t>Hệ thống SmartFee Apartment được định hướng phát triển theo mô hình Web-only nhằm tối ưu hóa nguồn lực và thời gian triển khai. Yếu tố cốt lõi định hình kiến trúc là khả năng xử lý nghiệp vụ tài chính đồng loạt (batch processing), tính bảo mật và khả năng thích ứng màn hình đa thiết bị (Responsive) để cư dân sử dụng trên điện thoại di động mượt mà như một ứng dụng gốc (Native App).</w:t>
-      </w:r>
-    </w:p>
-    <w:p>
-      <w:pPr>
-        <w:pStyle w:val="Heading3"/>
-      </w:pPr>
-      <w:bookmarkStart w:id="86" w:name="_Toc227612311"/>
-      <w:r>
-        <w:t>4.1.2 Yêu cầu chức năng ảnh hưởng kiến trúc (ASFRs)</w:t>
-      </w:r>
-      <w:bookmarkEnd w:id="86"/>
     </w:p>
     <w:p>
       <w:r>
@@ -22282,11 +22256,11 @@
       <w:pPr>
         <w:pStyle w:val="Heading3"/>
       </w:pPr>
-      <w:bookmarkStart w:id="87" w:name="_Toc227612312"/>
+      <w:bookmarkStart w:id="86" w:name="_Toc227612312"/>
       <w:r>
         <w:t>4.1.3 Các thuộc tính chất lượng (Quality Attribute Drivers)</w:t>
       </w:r>
-      <w:bookmarkEnd w:id="87"/>
+      <w:bookmarkEnd w:id="86"/>
     </w:p>
     <w:p>
       <w:r>
@@ -22370,11 +22344,11 @@
       <w:pPr>
         <w:pStyle w:val="Heading3"/>
       </w:pPr>
-      <w:bookmarkStart w:id="88" w:name="_Toc227612313"/>
+      <w:bookmarkStart w:id="87" w:name="_Toc227612313"/>
       <w:r>
         <w:t>4.1.4 Ràng buộc (Constraints)</w:t>
       </w:r>
-      <w:bookmarkEnd w:id="88"/>
+      <w:bookmarkEnd w:id="87"/>
     </w:p>
     <w:tbl>
       <w:tblPr>
@@ -22582,11 +22556,11 @@
       <w:pPr>
         <w:pStyle w:val="Heading3"/>
       </w:pPr>
-      <w:bookmarkStart w:id="89" w:name="_Toc227612314"/>
+      <w:bookmarkStart w:id="88" w:name="_Toc227612314"/>
       <w:r>
         <w:t>4.1.5 Ma trận ưu tiên các Drivers</w:t>
       </w:r>
-      <w:bookmarkEnd w:id="89"/>
+      <w:bookmarkEnd w:id="88"/>
     </w:p>
     <w:p>
       <w:pPr>
@@ -22671,36 +22645,36 @@
       <w:pPr>
         <w:pStyle w:val="Heading2"/>
       </w:pPr>
-      <w:bookmarkStart w:id="90" w:name="_Toc227612315"/>
+      <w:bookmarkStart w:id="89" w:name="_Toc227612315"/>
       <w:r>
         <w:t>4.2 QUYẾT ĐỊNH STACK CÔNG NGHỆ (TECHNOLOGY STACK)</w:t>
       </w:r>
+      <w:bookmarkEnd w:id="89"/>
+    </w:p>
+    <w:p>
+      <w:pPr>
+        <w:pStyle w:val="Heading3"/>
+      </w:pPr>
+      <w:bookmarkStart w:id="90" w:name="_Toc227612316"/>
+      <w:r>
+        <w:t>4.2.1 Tổng quan Stack Công nghệ</w:t>
+      </w:r>
       <w:bookmarkEnd w:id="90"/>
     </w:p>
     <w:p>
+      <w:r>
+        <w:t>Kiến trúc tổng thể được phân tách rõ ràng giữa Frontend (Client) và Backend (Server) giao tiếp qua RESTful API. Hệ thống loại bỏ hoàn toàn các framework phát triển Mobile (như React Native) để tối ưu nguồn lực.</w:t>
+      </w:r>
+    </w:p>
+    <w:p>
       <w:pPr>
         <w:pStyle w:val="Heading3"/>
       </w:pPr>
-      <w:bookmarkStart w:id="91" w:name="_Toc227612316"/>
-      <w:r>
-        <w:t>4.2.1 Tổng quan Stack Công nghệ</w:t>
+      <w:bookmarkStart w:id="91" w:name="_Toc227612317"/>
+      <w:r>
+        <w:t>4.2.2 Quyết định Công nghệ theo Hạng mục</w:t>
       </w:r>
       <w:bookmarkEnd w:id="91"/>
-    </w:p>
-    <w:p>
-      <w:r>
-        <w:t>Kiến trúc tổng thể được phân tách rõ ràng giữa Frontend (Client) và Backend (Server) giao tiếp qua RESTful API. Hệ thống loại bỏ hoàn toàn các framework phát triển Mobile (như React Native) để tối ưu nguồn lực.</w:t>
-      </w:r>
-    </w:p>
-    <w:p>
-      <w:pPr>
-        <w:pStyle w:val="Heading3"/>
-      </w:pPr>
-      <w:bookmarkStart w:id="92" w:name="_Toc227612317"/>
-      <w:r>
-        <w:t>4.2.2 Quyết định Công nghệ theo Hạng mục</w:t>
-      </w:r>
-      <w:bookmarkEnd w:id="92"/>
     </w:p>
     <w:p>
       <w:pPr>
@@ -22851,11 +22825,11 @@
       <w:pPr>
         <w:pStyle w:val="Heading3"/>
       </w:pPr>
-      <w:bookmarkStart w:id="93" w:name="_Toc227612318"/>
+      <w:bookmarkStart w:id="92" w:name="_Toc227612318"/>
       <w:r>
         <w:t>4.2.3 Ma trận Quyết định (Decision Matrix)</w:t>
       </w:r>
-      <w:bookmarkEnd w:id="93"/>
+      <w:bookmarkEnd w:id="92"/>
     </w:p>
     <w:p>
       <w:r>
@@ -23124,11 +23098,11 @@
       <w:pPr>
         <w:pStyle w:val="Heading3"/>
       </w:pPr>
-      <w:bookmarkStart w:id="94" w:name="_Toc227612319"/>
+      <w:bookmarkStart w:id="93" w:name="_Toc227612319"/>
       <w:r>
         <w:t>4.2.4 Truy xuất nguồn gốc và Rủi ro (Traceability &amp; Risks)</w:t>
       </w:r>
-      <w:bookmarkEnd w:id="94"/>
+      <w:bookmarkEnd w:id="93"/>
     </w:p>
     <w:p>
       <w:pPr>
@@ -23236,21 +23210,21 @@
       <w:pPr>
         <w:pStyle w:val="Heading2"/>
       </w:pPr>
-      <w:bookmarkStart w:id="95" w:name="_Toc227612320"/>
+      <w:bookmarkStart w:id="94" w:name="_Toc227612320"/>
       <w:r>
         <w:t>4.3 KIẾN TRÚC HỆ THỐNG (SYSTEM ARCHITECTURE)</w:t>
       </w:r>
+      <w:bookmarkEnd w:id="94"/>
+    </w:p>
+    <w:p>
+      <w:pPr>
+        <w:pStyle w:val="Heading3"/>
+      </w:pPr>
+      <w:bookmarkStart w:id="95" w:name="_Toc227612321"/>
+      <w:r>
+        <w:t>4.3.1 Sơ đồ kiến trúc tổng quan (Architecture Overview)</w:t>
+      </w:r>
       <w:bookmarkEnd w:id="95"/>
-    </w:p>
-    <w:p>
-      <w:pPr>
-        <w:pStyle w:val="Heading3"/>
-      </w:pPr>
-      <w:bookmarkStart w:id="96" w:name="_Toc227612321"/>
-      <w:r>
-        <w:t>4.3.1 Sơ đồ kiến trúc tổng quan (Architecture Overview)</w:t>
-      </w:r>
-      <w:bookmarkEnd w:id="96"/>
     </w:p>
     <w:p>
       <w:r>
@@ -23325,11 +23299,11 @@
       <w:pPr>
         <w:pStyle w:val="Heading3"/>
       </w:pPr>
-      <w:bookmarkStart w:id="97" w:name="_Toc227612322"/>
+      <w:bookmarkStart w:id="96" w:name="_Toc227612322"/>
       <w:r>
         <w:t>4.3.2 Phân rã thành phần Logic (Component Decomposition)</w:t>
       </w:r>
-      <w:bookmarkEnd w:id="97"/>
+      <w:bookmarkEnd w:id="96"/>
     </w:p>
     <w:p>
       <w:r>
@@ -23430,11 +23404,11 @@
       <w:pPr>
         <w:pStyle w:val="Heading3"/>
       </w:pPr>
-      <w:bookmarkStart w:id="98" w:name="_Toc227612323"/>
+      <w:bookmarkStart w:id="97" w:name="_Toc227612323"/>
       <w:r>
         <w:t>4.3.3 Kiến trúc Triển khai (Deployment Architecture)</w:t>
       </w:r>
-      <w:bookmarkEnd w:id="98"/>
+      <w:bookmarkEnd w:id="97"/>
     </w:p>
     <w:p>
       <w:r>
@@ -23499,12 +23473,12 @@
       <w:pPr>
         <w:pStyle w:val="Heading3"/>
       </w:pPr>
-      <w:bookmarkStart w:id="99" w:name="_Toc227612324"/>
+      <w:bookmarkStart w:id="98" w:name="_Toc227612324"/>
       <w:r>
         <w:lastRenderedPageBreak/>
         <w:t>4.3.4 Ma trận giao tiếp (Communication Patterns)</w:t>
       </w:r>
-      <w:bookmarkEnd w:id="99"/>
+      <w:bookmarkEnd w:id="98"/>
     </w:p>
     <w:tbl>
       <w:tblPr>
@@ -23912,11 +23886,11 @@
       <w:pPr>
         <w:pStyle w:val="Heading3"/>
       </w:pPr>
-      <w:bookmarkStart w:id="100" w:name="_Toc227612325"/>
+      <w:bookmarkStart w:id="99" w:name="_Toc227612325"/>
       <w:r>
         <w:t>4.3.5 Các Quyết Định Kiến Trúc (Architecture Decision Records - ADRs)</w:t>
       </w:r>
-      <w:bookmarkEnd w:id="100"/>
+      <w:bookmarkEnd w:id="99"/>
     </w:p>
     <w:p>
       <w:r>
@@ -24106,31 +24080,31 @@
       <w:pPr>
         <w:pStyle w:val="Heading1"/>
       </w:pPr>
-      <w:bookmarkStart w:id="101" w:name="_Toc227612326"/>
+      <w:bookmarkStart w:id="100" w:name="_Toc227612326"/>
       <w:r>
         <w:t>Tuần 5: THIẾT KẾ CHI TIẾT HỆ THỐNG</w:t>
       </w:r>
+      <w:bookmarkEnd w:id="100"/>
+    </w:p>
+    <w:p>
+      <w:pPr>
+        <w:pStyle w:val="Heading2"/>
+      </w:pPr>
+      <w:bookmarkStart w:id="101" w:name="_Toc227612327"/>
+      <w:r>
+        <w:t>5.1 THIẾT KẾ THÀNH PHẦN (COMPONENT DESIGN)</w:t>
+      </w:r>
       <w:bookmarkEnd w:id="101"/>
     </w:p>
     <w:p>
       <w:pPr>
-        <w:pStyle w:val="Heading2"/>
-      </w:pPr>
-      <w:bookmarkStart w:id="102" w:name="_Toc227612327"/>
-      <w:r>
-        <w:t>5.1 THIẾT KẾ THÀNH PHẦN (COMPONENT DESIGN)</w:t>
+        <w:pStyle w:val="Heading3"/>
+      </w:pPr>
+      <w:bookmarkStart w:id="102" w:name="_Toc227612328"/>
+      <w:r>
+        <w:t>5.1.1 Danh mục các thành phần (Component Catalog)</w:t>
       </w:r>
       <w:bookmarkEnd w:id="102"/>
-    </w:p>
-    <w:p>
-      <w:pPr>
-        <w:pStyle w:val="Heading3"/>
-      </w:pPr>
-      <w:bookmarkStart w:id="103" w:name="_Toc227612328"/>
-      <w:r>
-        <w:t>5.1.1 Danh mục các thành phần (Component Catalog)</w:t>
-      </w:r>
-      <w:bookmarkEnd w:id="103"/>
     </w:p>
     <w:p>
       <w:r>
@@ -24592,11 +24566,11 @@
       <w:pPr>
         <w:pStyle w:val="Heading3"/>
       </w:pPr>
-      <w:bookmarkStart w:id="104" w:name="_Toc227612329"/>
+      <w:bookmarkStart w:id="103" w:name="_Toc227612329"/>
       <w:r>
         <w:t>5.1.2 Ma trận trách nhiệm (Responsibility Matrix)</w:t>
       </w:r>
-      <w:bookmarkEnd w:id="104"/>
+      <w:bookmarkEnd w:id="103"/>
     </w:p>
     <w:p>
       <w:r>
@@ -24911,21 +24885,21 @@
       <w:pPr>
         <w:pStyle w:val="Heading2"/>
       </w:pPr>
-      <w:bookmarkStart w:id="105" w:name="_Toc227612330"/>
+      <w:bookmarkStart w:id="104" w:name="_Toc227612330"/>
       <w:r>
         <w:t>5.2 THIẾT KẾ GIAO DIỆN LẬP TRÌNH (API DESIGN)</w:t>
       </w:r>
+      <w:bookmarkEnd w:id="104"/>
+    </w:p>
+    <w:p>
+      <w:pPr>
+        <w:pStyle w:val="Heading3"/>
+      </w:pPr>
+      <w:bookmarkStart w:id="105" w:name="_Toc227612331"/>
+      <w:r>
+        <w:t>5.2.1 Tổng quan về API</w:t>
+      </w:r>
       <w:bookmarkEnd w:id="105"/>
-    </w:p>
-    <w:p>
-      <w:pPr>
-        <w:pStyle w:val="Heading3"/>
-      </w:pPr>
-      <w:bookmarkStart w:id="106" w:name="_Toc227612331"/>
-      <w:r>
-        <w:t>5.2.1 Tổng quan về API</w:t>
-      </w:r>
-      <w:bookmarkEnd w:id="106"/>
     </w:p>
     <w:p>
       <w:r>
@@ -24992,11 +24966,11 @@
       <w:pPr>
         <w:pStyle w:val="Heading3"/>
       </w:pPr>
-      <w:bookmarkStart w:id="107" w:name="_Toc227612332"/>
+      <w:bookmarkStart w:id="106" w:name="_Toc227612332"/>
       <w:r>
         <w:t>5.2.2 Đặc tả các Endpoint chính</w:t>
       </w:r>
-      <w:bookmarkEnd w:id="107"/>
+      <w:bookmarkEnd w:id="106"/>
     </w:p>
     <w:tbl>
       <w:tblPr>
@@ -25460,21 +25434,21 @@
       <w:pPr>
         <w:pStyle w:val="Heading2"/>
       </w:pPr>
-      <w:bookmarkStart w:id="108" w:name="_Toc227612333"/>
+      <w:bookmarkStart w:id="107" w:name="_Toc227612333"/>
       <w:r>
         <w:t>5.3 KIẾN TRÚC DỮ LIỆU VẬT LÝ (PHYSICAL DATA ARCHITECTURE)</w:t>
       </w:r>
+      <w:bookmarkEnd w:id="107"/>
+    </w:p>
+    <w:p>
+      <w:pPr>
+        <w:pStyle w:val="Heading3"/>
+      </w:pPr>
+      <w:bookmarkStart w:id="108" w:name="_Toc227612334"/>
+      <w:r>
+        <w:t>5.3.1 Nền tảng Cơ sở dữ liệu</w:t>
+      </w:r>
       <w:bookmarkEnd w:id="108"/>
-    </w:p>
-    <w:p>
-      <w:pPr>
-        <w:pStyle w:val="Heading3"/>
-      </w:pPr>
-      <w:bookmarkStart w:id="109" w:name="_Toc227612334"/>
-      <w:r>
-        <w:t>5.3.1 Nền tảng Cơ sở dữ liệu</w:t>
-      </w:r>
-      <w:bookmarkEnd w:id="109"/>
     </w:p>
     <w:p>
       <w:pPr>
@@ -25516,11 +25490,11 @@
       <w:pPr>
         <w:pStyle w:val="Heading3"/>
       </w:pPr>
-      <w:bookmarkStart w:id="110" w:name="_Toc227612335"/>
+      <w:bookmarkStart w:id="109" w:name="_Toc227612335"/>
       <w:r>
         <w:t>5.3.2 Đặc tả các bảng chính (Table Specifications)</w:t>
       </w:r>
-      <w:bookmarkEnd w:id="110"/>
+      <w:bookmarkEnd w:id="109"/>
     </w:p>
     <w:p>
       <w:r>
@@ -25746,21 +25720,21 @@
       <w:pPr>
         <w:pStyle w:val="Heading2"/>
       </w:pPr>
-      <w:bookmarkStart w:id="111" w:name="_Toc227612336"/>
+      <w:bookmarkStart w:id="110" w:name="_Toc227612336"/>
       <w:r>
         <w:t>5.4 THIẾT KẾ BẢO MẬT (SECURITY DESIGN)</w:t>
       </w:r>
+      <w:bookmarkEnd w:id="110"/>
+    </w:p>
+    <w:p>
+      <w:pPr>
+        <w:pStyle w:val="Heading3"/>
+      </w:pPr>
+      <w:bookmarkStart w:id="111" w:name="_Toc227612337"/>
+      <w:r>
+        <w:t>5.4.1 Cơ chế Xác thực (Authentication)</w:t>
+      </w:r>
       <w:bookmarkEnd w:id="111"/>
-    </w:p>
-    <w:p>
-      <w:pPr>
-        <w:pStyle w:val="Heading3"/>
-      </w:pPr>
-      <w:bookmarkStart w:id="112" w:name="_Toc227612337"/>
-      <w:r>
-        <w:t>5.4.1 Cơ chế Xác thực (Authentication)</w:t>
-      </w:r>
-      <w:bookmarkEnd w:id="112"/>
     </w:p>
     <w:p>
       <w:r>
@@ -25814,11 +25788,11 @@
       <w:pPr>
         <w:pStyle w:val="Heading3"/>
       </w:pPr>
-      <w:bookmarkStart w:id="113" w:name="_Toc227612338"/>
+      <w:bookmarkStart w:id="112" w:name="_Toc227612338"/>
       <w:r>
         <w:t>5.4.2 Cơ chế Phân quyền (Authorization - RBAC)</w:t>
       </w:r>
-      <w:bookmarkEnd w:id="113"/>
+      <w:bookmarkEnd w:id="112"/>
     </w:p>
     <w:p>
       <w:r>
@@ -26179,12 +26153,12 @@
       <w:pPr>
         <w:pStyle w:val="Heading3"/>
       </w:pPr>
-      <w:bookmarkStart w:id="114" w:name="_Toc227612339"/>
+      <w:bookmarkStart w:id="113" w:name="_Toc227612339"/>
       <w:r>
         <w:lastRenderedPageBreak/>
         <w:t>5.4.3 Bảo vệ dữ liệu (Data Protection)</w:t>
       </w:r>
-      <w:bookmarkEnd w:id="114"/>
+      <w:bookmarkEnd w:id="113"/>
     </w:p>
     <w:p>
       <w:pPr>
@@ -26311,40 +26285,89 @@
       <w:pPr>
         <w:pStyle w:val="Heading1"/>
       </w:pPr>
-      <w:bookmarkStart w:id="115" w:name="_Toc227612340"/>
+      <w:bookmarkStart w:id="114" w:name="_Toc227612340"/>
       <w:r>
         <w:t>PHẦN 6 - THIẾT KẾ CHI TIẾT (LOW-LEVEL DESIGN)</w:t>
       </w:r>
+      <w:bookmarkEnd w:id="114"/>
+    </w:p>
+    <w:p>
+      <w:pPr>
+        <w:pStyle w:val="Heading2"/>
+      </w:pPr>
+      <w:bookmarkStart w:id="115" w:name="_Toc227612341"/>
+      <w:r>
+        <w:t>6.1 Thiết Kế Lớp (Class Design)</w:t>
+      </w:r>
       <w:bookmarkEnd w:id="115"/>
     </w:p>
     <w:p>
       <w:pPr>
-        <w:pStyle w:val="Heading2"/>
-      </w:pPr>
-      <w:bookmarkStart w:id="116" w:name="_Toc227612341"/>
-      <w:r>
-        <w:t>6.1 Thiết Kế Lớp (Class Design)</w:t>
-      </w:r>
-      <w:bookmarkEnd w:id="116"/>
-    </w:p>
-    <w:p>
-      <w:r>
         <w:rPr>
           <w:i/>
           <w:iCs/>
         </w:rPr>
+      </w:pPr>
+      <w:r>
+        <w:rPr>
+          <w:i/>
+          <w:iCs/>
+        </w:rPr>
         <w:t>Mục đích: Thiết kế cấu trúc lớp chi tiết cho từng thành phần bao gồm thuộc tính, phương thức và các mối quan hệ. Bước này chuyển đổi các thành phần kiến trúc từ Tuần 5 thành các bản thiết kế hướng đối tượng cụ thể mà lập trình viên có thể trực tiếp triển khai thành mã nguồn.</w:t>
       </w:r>
     </w:p>
     <w:p>
+      <w:r>
+        <w:rPr>
+          <w:noProof/>
+        </w:rPr>
+        <w:lastRenderedPageBreak/>
+        <w:drawing>
+          <wp:inline distT="0" distB="0" distL="0" distR="0" wp14:anchorId="30BB302A" wp14:editId="09C5ED3F">
+            <wp:extent cx="5731510" cy="5142230"/>
+            <wp:effectExtent l="0" t="0" r="0" b="0"/>
+            <wp:docPr id="346401754" name="Picture 1"/>
+            <wp:cNvGraphicFramePr>
+              <a:graphicFrameLocks xmlns:a="http://schemas.openxmlformats.org/drawingml/2006/main" noChangeAspect="1"/>
+            </wp:cNvGraphicFramePr>
+            <a:graphic xmlns:a="http://schemas.openxmlformats.org/drawingml/2006/main">
+              <a:graphicData uri="http://schemas.openxmlformats.org/drawingml/2006/picture">
+                <pic:pic xmlns:pic="http://schemas.openxmlformats.org/drawingml/2006/picture">
+                  <pic:nvPicPr>
+                    <pic:cNvPr id="346401754" name=""/>
+                    <pic:cNvPicPr/>
+                  </pic:nvPicPr>
+                  <pic:blipFill>
+                    <a:blip r:embed="rId28"/>
+                    <a:stretch>
+                      <a:fillRect/>
+                    </a:stretch>
+                  </pic:blipFill>
+                  <pic:spPr>
+                    <a:xfrm>
+                      <a:off x="0" y="0"/>
+                      <a:ext cx="5731510" cy="5142230"/>
+                    </a:xfrm>
+                    <a:prstGeom prst="rect">
+                      <a:avLst/>
+                    </a:prstGeom>
+                  </pic:spPr>
+                </pic:pic>
+              </a:graphicData>
+            </a:graphic>
+          </wp:inline>
+        </w:drawing>
+      </w:r>
+    </w:p>
+    <w:p>
       <w:pPr>
         <w:pStyle w:val="Heading3"/>
       </w:pPr>
-      <w:bookmarkStart w:id="117" w:name="_Toc227612342"/>
+      <w:bookmarkStart w:id="116" w:name="_Toc227612342"/>
       <w:r>
         <w:t>6.1.1 Các lớp Thực thể (Entity Classes / Domain Model)</w:t>
       </w:r>
-      <w:bookmarkEnd w:id="117"/>
+      <w:bookmarkEnd w:id="116"/>
     </w:p>
     <w:p>
       <w:r>
@@ -26435,7 +26458,6 @@
           <w:i/>
           <w:iCs/>
         </w:rPr>
-        <w:lastRenderedPageBreak/>
         <w:t>Thuộc tính</w:t>
       </w:r>
       <w:r>
@@ -26472,6 +26494,7 @@
           <w:b/>
           <w:bCs/>
         </w:rPr>
+        <w:lastRenderedPageBreak/>
         <w:t>MeterReading</w:t>
       </w:r>
       <w:r>
@@ -26590,11 +26613,11 @@
       <w:pPr>
         <w:pStyle w:val="Heading3"/>
       </w:pPr>
-      <w:bookmarkStart w:id="118" w:name="_Toc227612343"/>
+      <w:bookmarkStart w:id="117" w:name="_Toc227612343"/>
       <w:r>
         <w:t>6.1.2 Các lớp Controller, Service &amp; Repository chính</w:t>
       </w:r>
-      <w:bookmarkEnd w:id="118"/>
+      <w:bookmarkEnd w:id="117"/>
     </w:p>
     <w:p>
       <w:r>
@@ -26777,7 +26800,6 @@
         </w:numPr>
       </w:pPr>
       <w:r>
-        <w:lastRenderedPageBreak/>
         <w:t>+ handleVNPayCallback(params: Map): PaymentResultDTO</w:t>
       </w:r>
     </w:p>
@@ -26818,6 +26840,7 @@
         </w:numPr>
       </w:pPr>
       <w:r>
+        <w:lastRenderedPageBreak/>
         <w:t>+ verifyTransaction(txRef: String): boolean (Thực thi BR-08 đối soát giao dịch).</w:t>
       </w:r>
     </w:p>
@@ -26825,11 +26848,11 @@
       <w:pPr>
         <w:pStyle w:val="Heading3"/>
       </w:pPr>
-      <w:bookmarkStart w:id="119" w:name="_Toc227612344"/>
+      <w:bookmarkStart w:id="118" w:name="_Toc227612344"/>
       <w:r>
         <w:t>6.1.3 Design Patterns Áp Dụng</w:t>
       </w:r>
-      <w:bookmarkEnd w:id="119"/>
+      <w:bookmarkEnd w:id="118"/>
     </w:p>
     <w:p>
       <w:pPr>
@@ -26896,11 +26919,11 @@
       <w:pPr>
         <w:pStyle w:val="Heading2"/>
       </w:pPr>
-      <w:bookmarkStart w:id="120" w:name="_Toc227612345"/>
+      <w:bookmarkStart w:id="119" w:name="_Toc227612345"/>
       <w:r>
         <w:t>6.2 Thiết Kế Sơ Đồ Trình Tự (Sequence Diagrams)</w:t>
       </w:r>
-      <w:bookmarkEnd w:id="120"/>
+      <w:bookmarkEnd w:id="119"/>
     </w:p>
     <w:p>
       <w:r>
@@ -26915,11 +26938,11 @@
       <w:pPr>
         <w:pStyle w:val="Heading3"/>
       </w:pPr>
-      <w:bookmarkStart w:id="121" w:name="_Toc227612346"/>
+      <w:bookmarkStart w:id="120" w:name="_Toc227612346"/>
       <w:r>
         <w:t>6.2.1 Biểu đồ trình tự: UC-R01 - Cư dân tra cứu hóa đơn</w:t>
       </w:r>
-      <w:bookmarkEnd w:id="121"/>
+      <w:bookmarkEnd w:id="120"/>
     </w:p>
     <w:p>
       <w:pPr>
@@ -27013,19 +27036,19 @@
         </w:numPr>
       </w:pPr>
       <w:r>
+        <w:t>InvoiceController trả JSON Response (HTTP 200) về cho Frontend hiển thị.</w:t>
+      </w:r>
+    </w:p>
+    <w:p>
+      <w:pPr>
+        <w:pStyle w:val="Heading3"/>
+      </w:pPr>
+      <w:bookmarkStart w:id="121" w:name="_Toc227612347"/>
+      <w:r>
         <w:lastRenderedPageBreak/>
-        <w:t>InvoiceController trả JSON Response (HTTP 200) về cho Frontend hiển thị.</w:t>
-      </w:r>
-    </w:p>
-    <w:p>
-      <w:pPr>
-        <w:pStyle w:val="Heading3"/>
-      </w:pPr>
-      <w:bookmarkStart w:id="122" w:name="_Toc227612347"/>
-      <w:r>
         <w:t>6.2.2 Biểu đồ trình tự: UC-R02 - Thanh toán VNPay</w:t>
       </w:r>
-      <w:bookmarkEnd w:id="122"/>
+      <w:bookmarkEnd w:id="121"/>
     </w:p>
     <w:p>
       <w:pPr>
@@ -27115,11 +27138,11 @@
       <w:pPr>
         <w:pStyle w:val="Heading3"/>
       </w:pPr>
-      <w:bookmarkStart w:id="123" w:name="_Toc227612348"/>
+      <w:bookmarkStart w:id="122" w:name="_Toc227612348"/>
       <w:r>
         <w:t>6.2.3 Biểu đồ trình tự: UC-M03 - BQL Tính phí đồng loạt</w:t>
       </w:r>
-      <w:bookmarkEnd w:id="123"/>
+      <w:bookmarkEnd w:id="122"/>
     </w:p>
     <w:p>
       <w:pPr>
@@ -27239,12 +27262,12 @@
       <w:pPr>
         <w:pStyle w:val="Heading2"/>
       </w:pPr>
-      <w:bookmarkStart w:id="124" w:name="_Toc227612349"/>
+      <w:bookmarkStart w:id="123" w:name="_Toc227612349"/>
       <w:r>
         <w:lastRenderedPageBreak/>
         <w:t>6.3 Thiết Kế UI (High-Fidelity)</w:t>
       </w:r>
-      <w:bookmarkEnd w:id="124"/>
+      <w:bookmarkEnd w:id="123"/>
     </w:p>
     <w:p>
       <w:r>
@@ -27259,11 +27282,11 @@
       <w:pPr>
         <w:pStyle w:val="Heading3"/>
       </w:pPr>
-      <w:bookmarkStart w:id="125" w:name="_Toc227612350"/>
+      <w:bookmarkStart w:id="124" w:name="_Toc227612350"/>
       <w:r>
         <w:t>6.3.1 Hệ Thống Thiết Kế (UI Kit)</w:t>
       </w:r>
-      <w:bookmarkEnd w:id="125"/>
+      <w:bookmarkEnd w:id="124"/>
     </w:p>
     <w:p>
       <w:r>
@@ -27406,11 +27429,11 @@
       <w:pPr>
         <w:pStyle w:val="Heading3"/>
       </w:pPr>
-      <w:bookmarkStart w:id="126" w:name="_Toc227612351"/>
+      <w:bookmarkStart w:id="125" w:name="_Toc227612351"/>
       <w:r>
         <w:t>6.3.2 Danh sách các Màn hình Cốt lõi (Web Mockups)</w:t>
       </w:r>
-      <w:bookmarkEnd w:id="126"/>
+      <w:bookmarkEnd w:id="125"/>
     </w:p>
     <w:p>
       <w:pPr>
@@ -27513,11 +27536,11 @@
       <w:pPr>
         <w:pStyle w:val="Heading2"/>
       </w:pPr>
-      <w:bookmarkStart w:id="127" w:name="_Toc227612352"/>
+      <w:bookmarkStart w:id="126" w:name="_Toc227612352"/>
       <w:r>
         <w:t>6.4 Chi Tiết Thiết Kế Cơ Sở Dữ Liệu</w:t>
       </w:r>
-      <w:bookmarkEnd w:id="127"/>
+      <w:bookmarkEnd w:id="126"/>
     </w:p>
     <w:p>
       <w:r>
@@ -27532,11 +27555,11 @@
       <w:pPr>
         <w:pStyle w:val="Heading3"/>
       </w:pPr>
-      <w:bookmarkStart w:id="128" w:name="_Toc227612353"/>
+      <w:bookmarkStart w:id="127" w:name="_Toc227612353"/>
       <w:r>
         <w:t>6.4.1 Script DDL (Data Definition Language)</w:t>
       </w:r>
-      <w:bookmarkEnd w:id="128"/>
+      <w:bookmarkEnd w:id="127"/>
     </w:p>
     <w:p>
       <w:r>
@@ -27818,11 +27841,11 @@
       <w:pPr>
         <w:pStyle w:val="Heading3"/>
       </w:pPr>
-      <w:bookmarkStart w:id="129" w:name="_Toc227612354"/>
+      <w:bookmarkStart w:id="128" w:name="_Toc227612354"/>
       <w:r>
         <w:t>6.4.2 Chiến Lược Index</w:t>
       </w:r>
-      <w:bookmarkEnd w:id="129"/>
+      <w:bookmarkEnd w:id="128"/>
     </w:p>
     <w:p>
       <w:r>
@@ -27918,22 +27941,22 @@
       <w:pPr>
         <w:pStyle w:val="Heading1"/>
       </w:pPr>
-      <w:bookmarkStart w:id="130" w:name="_Toc227612355"/>
+      <w:bookmarkStart w:id="129" w:name="_Toc227612355"/>
       <w:r>
         <w:lastRenderedPageBreak/>
         <w:t>PHẦN 7 - THIẾT KẾ LOGIC CHI TIẾT VÀ KẾ HOẠCH TRIỂN KHAI</w:t>
       </w:r>
+      <w:bookmarkEnd w:id="129"/>
+    </w:p>
+    <w:p>
+      <w:pPr>
+        <w:pStyle w:val="Heading2"/>
+      </w:pPr>
+      <w:bookmarkStart w:id="130" w:name="_Toc227612356"/>
+      <w:r>
+        <w:t>7.1 Thiết Kế Thuật Toán (Algorithm Design)</w:t>
+      </w:r>
       <w:bookmarkEnd w:id="130"/>
-    </w:p>
-    <w:p>
-      <w:pPr>
-        <w:pStyle w:val="Heading2"/>
-      </w:pPr>
-      <w:bookmarkStart w:id="131" w:name="_Toc227612356"/>
-      <w:r>
-        <w:t>7.1 Thiết Kế Thuật Toán (Algorithm Design)</w:t>
-      </w:r>
-      <w:bookmarkEnd w:id="131"/>
     </w:p>
     <w:p>
       <w:r>
@@ -27948,11 +27971,11 @@
       <w:pPr>
         <w:pStyle w:val="Heading3"/>
       </w:pPr>
-      <w:bookmarkStart w:id="132" w:name="_Toc227612357"/>
+      <w:bookmarkStart w:id="131" w:name="_Toc227612357"/>
       <w:r>
         <w:t>7.1.1 Thuật toán Tính phí điện lũy kế (BR-01)</w:t>
       </w:r>
-      <w:bookmarkEnd w:id="132"/>
+      <w:bookmarkEnd w:id="131"/>
     </w:p>
     <w:p>
       <w:pPr>
@@ -28096,11 +28119,11 @@
       <w:pPr>
         <w:pStyle w:val="Heading3"/>
       </w:pPr>
-      <w:bookmarkStart w:id="133" w:name="_Toc227612358"/>
+      <w:bookmarkStart w:id="132" w:name="_Toc227612358"/>
       <w:r>
         <w:t>7.1.2 Thuật toán Tự động nhắc nợ (Auto-Reminder)</w:t>
       </w:r>
-      <w:bookmarkEnd w:id="133"/>
+      <w:bookmarkEnd w:id="132"/>
     </w:p>
     <w:p>
       <w:pPr>
@@ -28242,11 +28265,11 @@
       <w:pPr>
         <w:pStyle w:val="Heading3"/>
       </w:pPr>
-      <w:bookmarkStart w:id="134" w:name="_Toc227612359"/>
+      <w:bookmarkStart w:id="133" w:name="_Toc227612359"/>
       <w:r>
         <w:t>7.2 Thiết Kế Xử Lý Ngoại Lệ (Error Handling Design)</w:t>
       </w:r>
-      <w:bookmarkEnd w:id="134"/>
+      <w:bookmarkEnd w:id="133"/>
     </w:p>
     <w:p>
       <w:r>
@@ -28261,11 +28284,11 @@
       <w:pPr>
         <w:pStyle w:val="Heading3"/>
       </w:pPr>
-      <w:bookmarkStart w:id="135" w:name="_Toc227612360"/>
+      <w:bookmarkStart w:id="134" w:name="_Toc227612360"/>
       <w:r>
         <w:t>7.2.1 Cấu trúc phân cấp ngoại lệ (Exception Hierarchy)</w:t>
       </w:r>
-      <w:bookmarkEnd w:id="135"/>
+      <w:bookmarkEnd w:id="134"/>
     </w:p>
     <w:p>
       <w:pPr>
@@ -28373,11 +28396,11 @@
       <w:pPr>
         <w:pStyle w:val="Heading3"/>
       </w:pPr>
-      <w:bookmarkStart w:id="136" w:name="_Toc227612361"/>
+      <w:bookmarkStart w:id="135" w:name="_Toc227612361"/>
       <w:r>
         <w:t>7.2.2 Danh mục mã lỗi hệ thống (Error Code Catalog)</w:t>
       </w:r>
-      <w:bookmarkEnd w:id="136"/>
+      <w:bookmarkEnd w:id="135"/>
     </w:p>
     <w:tbl>
       <w:tblPr>
@@ -28717,11 +28740,11 @@
       <w:pPr>
         <w:pStyle w:val="Heading3"/>
       </w:pPr>
-      <w:bookmarkStart w:id="137" w:name="_Toc227612362"/>
+      <w:bookmarkStart w:id="136" w:name="_Toc227612362"/>
       <w:r>
         <w:t>7.3 Chiến Lược Kiểm Thử (Testing Strategy)</w:t>
       </w:r>
-      <w:bookmarkEnd w:id="137"/>
+      <w:bookmarkEnd w:id="136"/>
     </w:p>
     <w:p>
       <w:r>
@@ -28736,11 +28759,11 @@
       <w:pPr>
         <w:pStyle w:val="Heading3"/>
       </w:pPr>
-      <w:bookmarkStart w:id="138" w:name="_Toc227612363"/>
+      <w:bookmarkStart w:id="137" w:name="_Toc227612363"/>
       <w:r>
         <w:t>7.3.1 Các cấp độ kiểm thử</w:t>
       </w:r>
-      <w:bookmarkEnd w:id="138"/>
+      <w:bookmarkEnd w:id="137"/>
     </w:p>
     <w:p>
       <w:pPr>
@@ -28830,11 +28853,11 @@
       <w:pPr>
         <w:pStyle w:val="Heading3"/>
       </w:pPr>
-      <w:bookmarkStart w:id="139" w:name="_Toc227612364"/>
+      <w:bookmarkStart w:id="138" w:name="_Toc227612364"/>
       <w:r>
         <w:t>7.3.2 Kịch bản kiểm thử mẫu (Test Case Specification)</w:t>
       </w:r>
-      <w:bookmarkEnd w:id="139"/>
+      <w:bookmarkEnd w:id="138"/>
     </w:p>
     <w:p>
       <w:pPr>
@@ -28961,12 +28984,12 @@
       <w:pPr>
         <w:pStyle w:val="Heading3"/>
       </w:pPr>
-      <w:bookmarkStart w:id="140" w:name="_Toc227612365"/>
+      <w:bookmarkStart w:id="139" w:name="_Toc227612365"/>
       <w:r>
         <w:lastRenderedPageBreak/>
         <w:t>7.4 Tiêu Chuẩn Phát Triển (Development Standards)</w:t>
       </w:r>
-      <w:bookmarkEnd w:id="140"/>
+      <w:bookmarkEnd w:id="139"/>
     </w:p>
     <w:p>
       <w:r>
@@ -28981,11 +29004,11 @@
       <w:pPr>
         <w:pStyle w:val="Heading3"/>
       </w:pPr>
-      <w:bookmarkStart w:id="141" w:name="_Toc227612366"/>
+      <w:bookmarkStart w:id="140" w:name="_Toc227612366"/>
       <w:r>
         <w:t>7.4.1 Quy tắc đặt tên (Naming Conventions)</w:t>
       </w:r>
-      <w:bookmarkEnd w:id="141"/>
+      <w:bookmarkEnd w:id="140"/>
     </w:p>
     <w:p>
       <w:pPr>
@@ -29063,11 +29086,11 @@
       <w:pPr>
         <w:pStyle w:val="Heading3"/>
       </w:pPr>
-      <w:bookmarkStart w:id="142" w:name="_Toc227612367"/>
+      <w:bookmarkStart w:id="141" w:name="_Toc227612367"/>
       <w:r>
         <w:t>7.4.2 Tiêu chuẩn Bảo mật &amp; Code Quality</w:t>
       </w:r>
-      <w:bookmarkEnd w:id="142"/>
+      <w:bookmarkEnd w:id="141"/>
     </w:p>
     <w:p>
       <w:pPr>
@@ -29116,11 +29139,11 @@
       <w:pPr>
         <w:pStyle w:val="Heading3"/>
       </w:pPr>
-      <w:bookmarkStart w:id="143" w:name="_Toc227612368"/>
+      <w:bookmarkStart w:id="142" w:name="_Toc227612368"/>
       <w:r>
         <w:t>7.5 Kế Hoạch Triển Khai (Implementation Plan)</w:t>
       </w:r>
-      <w:bookmarkEnd w:id="143"/>
+      <w:bookmarkEnd w:id="142"/>
     </w:p>
     <w:p>
       <w:r>
@@ -29135,11 +29158,11 @@
       <w:pPr>
         <w:pStyle w:val="Heading3"/>
       </w:pPr>
-      <w:bookmarkStart w:id="144" w:name="_Toc227612369"/>
+      <w:bookmarkStart w:id="143" w:name="_Toc227612369"/>
       <w:r>
         <w:t>7.5.1 Phân chia công việc (WBS)</w:t>
       </w:r>
-      <w:bookmarkEnd w:id="144"/>
+      <w:bookmarkEnd w:id="143"/>
     </w:p>
     <w:p>
       <w:pPr>
@@ -29260,12 +29283,12 @@
       <w:pPr>
         <w:pStyle w:val="Heading3"/>
       </w:pPr>
-      <w:bookmarkStart w:id="145" w:name="_Toc227612370"/>
+      <w:bookmarkStart w:id="144" w:name="_Toc227612370"/>
       <w:r>
         <w:lastRenderedPageBreak/>
         <w:t>7.5.2 Quản trị rủi ro (Risk Register)</w:t>
       </w:r>
-      <w:bookmarkEnd w:id="145"/>
+      <w:bookmarkEnd w:id="144"/>
     </w:p>
     <w:tbl>
       <w:tblPr>
@@ -29533,8 +29556,8 @@
     </w:tbl>
     <w:p/>
     <w:sectPr>
-      <w:headerReference w:type="default" r:id="rId27"/>
-      <w:footerReference w:type="default" r:id="rId28"/>
+      <w:headerReference w:type="default" r:id="rId29"/>
+      <w:footerReference w:type="default" r:id="rId30"/>
       <w:pgSz w:w="11906" w:h="16838"/>
       <w:pgMar w:top="1440" w:right="1440" w:bottom="1440" w:left="1440" w:header="708" w:footer="708" w:gutter="0"/>
       <w:cols w:space="708"/>
@@ -29863,7 +29886,7 @@
       </w:r>
     </w:p>
   </w:comment>
-  <w:comment w:id="27" w:author="Nguyễn Văn Hậu" w:date="2026-04-15T09:52:00Z" w:initials="NV">
+  <w:comment w:id="43" w:author="Nguyễn Văn Hậu" w:date="2026-04-22T08:27:00Z" w:initials="NV">
     <w:p>
       <w:pPr>
         <w:pStyle w:val="CommentText"/>
@@ -29879,11 +29902,47 @@
         <w:rPr>
           <w:lang w:val="en-US"/>
         </w:rPr>
-        <w:t>Swimlane nên có start – end</w:t>
+        <w:t>Swimlane</w:t>
+      </w:r>
+      <w:r>
+        <w:t xml:space="preserve"> </w:t>
+      </w:r>
+      <w:r>
+        <w:rPr>
+          <w:lang w:val="en-US"/>
+        </w:rPr>
+        <w:t>nên</w:t>
+      </w:r>
+      <w:r>
+        <w:t xml:space="preserve"> </w:t>
+      </w:r>
+      <w:r>
+        <w:rPr>
+          <w:lang w:val="en-US"/>
+        </w:rPr>
+        <w:t>bắt</w:t>
+      </w:r>
+      <w:r>
+        <w:t xml:space="preserve"> đầu </w:t>
+      </w:r>
+      <w:r>
+        <w:rPr>
+          <w:lang w:val="en-US"/>
+        </w:rPr>
+        <w:t>từ</w:t>
+      </w:r>
+      <w:r>
+        <w:t xml:space="preserve"> </w:t>
+      </w:r>
+      <w:r>
+        <w:rPr>
+          <w:lang w:val="en-US"/>
+        </w:rPr>
+        <w:t>user</w:t>
       </w:r>
     </w:p>
   </w:comment>
-  <w:comment w:id="44" w:author="Nguyễn Văn Hậu" w:date="2026-04-22T08:27:00Z" w:initials="NV">
+  <w:comment w:id="45" w:author="Nguyễn Văn Hậu" w:date="2026-04-16T14:11:00Z" w:initials="NV">
     <w:p>
       <w:pPr>
         <w:pStyle w:val="CommentText"/>
@@ -29896,10 +29955,13 @@
         <w:annotationRef/>
       </w:r>
       <w:r>
+        <w:t>Làm lại ERD rồi các phần mô tả khác của 2.3. T</w:t>
+      </w:r>
+      <w:r>
         <w:rPr>
           <w:lang w:val="en-US"/>
         </w:rPr>
-        <w:t>Swimlane</w:t>
+        <w:t>ham</w:t>
       </w:r>
       <w:r>
         <w:t xml:space="preserve"> </w:t>
@@ -29908,7 +29970,7 @@
         <w:rPr>
           <w:lang w:val="en-US"/>
         </w:rPr>
-        <w:t>nên</w:t>
+        <w:t>khảo</w:t>
       </w:r>
       <w:r>
         <w:t xml:space="preserve"> </w:t>
@@ -29917,16 +29979,16 @@
         <w:rPr>
           <w:lang w:val="en-US"/>
         </w:rPr>
-        <w:t>bắt</w:t>
-      </w:r>
-      <w:r>
-        <w:t xml:space="preserve"> đầu </w:t>
+        <w:t>phần</w:t>
+      </w:r>
+      <w:r>
+        <w:t xml:space="preserve"> </w:t>
       </w:r>
       <w:r>
         <w:rPr>
           <w:lang w:val="en-US"/>
         </w:rPr>
-        <w:t>từ</w:t>
+        <w:t>có</w:t>
       </w:r>
       <w:r>
         <w:t xml:space="preserve"> </w:t>
@@ -29935,11 +29997,77 @@
         <w:rPr>
           <w:lang w:val="en-US"/>
         </w:rPr>
-        <w:t>user</w:t>
+        <w:t>sẵn</w:t>
+      </w:r>
+      <w:r>
+        <w:t xml:space="preserve">, </w:t>
+      </w:r>
+      <w:r>
+        <w:rPr>
+          <w:lang w:val="en-US"/>
+        </w:rPr>
+        <w:t>k</w:t>
+      </w:r>
+      <w:r>
+        <w:t xml:space="preserve"> </w:t>
+      </w:r>
+      <w:r>
+        <w:rPr>
+          <w:lang w:val="en-US"/>
+        </w:rPr>
+        <w:t>nhất</w:t>
+      </w:r>
+      <w:r>
+        <w:t xml:space="preserve"> thiết </w:t>
+      </w:r>
+      <w:r>
+        <w:rPr>
+          <w:lang w:val="en-US"/>
+        </w:rPr>
+        <w:t>phải</w:t>
+      </w:r>
+      <w:r>
+        <w:t xml:space="preserve"> </w:t>
+      </w:r>
+      <w:r>
+        <w:rPr>
+          <w:lang w:val="en-US"/>
+        </w:rPr>
+        <w:t>theo</w:t>
+      </w:r>
+      <w:r>
+        <w:t xml:space="preserve">, </w:t>
+      </w:r>
+      <w:r>
+        <w:rPr>
+          <w:lang w:val="en-US"/>
+        </w:rPr>
+        <w:t>có</w:t>
+      </w:r>
+      <w:r>
+        <w:t xml:space="preserve"> </w:t>
+      </w:r>
+      <w:r>
+        <w:rPr>
+          <w:lang w:val="en-US"/>
+        </w:rPr>
+        <w:t>thể</w:t>
+      </w:r>
+      <w:r>
+        <w:t xml:space="preserve"> </w:t>
+      </w:r>
+      <w:r>
+        <w:rPr>
+          <w:lang w:val="en-US"/>
+        </w:rPr>
+        <w:t>sửa</w:t>
+      </w:r>
+      <w:r>
+        <w:t>.</w:t>
       </w:r>
     </w:p>
   </w:comment>
-  <w:comment w:id="46" w:author="Nguyễn Văn Hậu" w:date="2026-04-16T14:11:00Z" w:initials="NV">
+  <w:comment w:id="52" w:author="Nguyễn Văn Hậu" w:date="2026-04-22T08:29:00Z" w:initials="NV">
     <w:p>
       <w:pPr>
         <w:pStyle w:val="CommentText"/>
@@ -29952,119 +30080,17 @@
         <w:annotationRef/>
       </w:r>
       <w:r>
-        <w:t>Làm lại ERD rồi các phần mô tả khác của 2.3. T</w:t>
-      </w:r>
-      <w:r>
         <w:rPr>
           <w:lang w:val="en-US"/>
         </w:rPr>
-        <w:t>ham</w:t>
-      </w:r>
-      <w:r>
-        <w:t xml:space="preserve"> </w:t>
-      </w:r>
-      <w:r>
-        <w:rPr>
-          <w:lang w:val="en-US"/>
-        </w:rPr>
-        <w:t>khảo</w:t>
-      </w:r>
-      <w:r>
-        <w:t xml:space="preserve"> </w:t>
-      </w:r>
-      <w:r>
-        <w:rPr>
-          <w:lang w:val="en-US"/>
-        </w:rPr>
-        <w:t>phần</w:t>
-      </w:r>
-      <w:r>
-        <w:t xml:space="preserve"> </w:t>
-      </w:r>
-      <w:r>
-        <w:rPr>
-          <w:lang w:val="en-US"/>
-        </w:rPr>
-        <w:t>có</w:t>
-      </w:r>
-      <w:r>
-        <w:t xml:space="preserve"> </w:t>
-      </w:r>
-      <w:r>
-        <w:rPr>
-          <w:lang w:val="en-US"/>
-        </w:rPr>
-        <w:t>sẵn</w:t>
-      </w:r>
-      <w:r>
-        <w:t xml:space="preserve">, </w:t>
-      </w:r>
-      <w:r>
-        <w:rPr>
-          <w:lang w:val="en-US"/>
-        </w:rPr>
-        <w:t>k</w:t>
-      </w:r>
-      <w:r>
-        <w:t xml:space="preserve"> </w:t>
-      </w:r>
-      <w:r>
-        <w:rPr>
-          <w:lang w:val="en-US"/>
-        </w:rPr>
-        <w:t>nhất</w:t>
-      </w:r>
-      <w:r>
-        <w:t xml:space="preserve"> thiết </w:t>
-      </w:r>
-      <w:r>
-        <w:rPr>
-          <w:lang w:val="en-US"/>
-        </w:rPr>
-        <w:t>phải</w:t>
-      </w:r>
-      <w:r>
-        <w:t xml:space="preserve"> </w:t>
-      </w:r>
-      <w:r>
-        <w:rPr>
-          <w:lang w:val="en-US"/>
-        </w:rPr>
-        <w:t>theo</w:t>
-      </w:r>
-      <w:r>
-        <w:t xml:space="preserve">, </w:t>
-      </w:r>
-      <w:r>
-        <w:rPr>
-          <w:lang w:val="en-US"/>
-        </w:rPr>
-        <w:t>có</w:t>
-      </w:r>
-      <w:r>
-        <w:t xml:space="preserve"> </w:t>
-      </w:r>
-      <w:r>
-        <w:rPr>
-          <w:lang w:val="en-US"/>
-        </w:rPr>
-        <w:t>thể</w:t>
-      </w:r>
-      <w:r>
-        <w:t xml:space="preserve"> </w:t>
-      </w:r>
-      <w:r>
-        <w:rPr>
-          <w:lang w:val="en-US"/>
-        </w:rPr>
-        <w:t>sửa</w:t>
-      </w:r>
-      <w:r>
-        <w:t>.</w:t>
+        <w:t>Erdplus</w:t>
+      </w:r>
+      <w:r>
+        <w:t>.com</w:t>
       </w:r>
     </w:p>
   </w:comment>
-  <w:comment w:id="53" w:author="Nguyễn Văn Hậu" w:date="2026-04-22T08:29:00Z" w:initials="NV">
+  <w:comment w:id="54" w:author="Nguyễn Văn Hậu" w:date="2026-04-15T09:51:00Z" w:initials="NV">
     <w:p>
       <w:pPr>
         <w:pStyle w:val="CommentText"/>
@@ -30077,17 +30103,53 @@
         <w:annotationRef/>
       </w:r>
       <w:r>
+        <w:t xml:space="preserve">Chưa </w:t>
+      </w:r>
+      <w:r>
         <w:rPr>
           <w:lang w:val="en-US"/>
         </w:rPr>
-        <w:t>Erdplus</w:t>
-      </w:r>
-      <w:r>
-        <w:t>.com</w:t>
+        <w:t>có</w:t>
+      </w:r>
+      <w:r>
+        <w:t xml:space="preserve"> </w:t>
+      </w:r>
+      <w:r>
+        <w:rPr>
+          <w:lang w:val="en-US"/>
+        </w:rPr>
+        <w:t>ERD</w:t>
+      </w:r>
+      <w:r>
+        <w:t xml:space="preserve"> </w:t>
+      </w:r>
+      <w:r>
+        <w:rPr>
+          <w:lang w:val="en-US"/>
+        </w:rPr>
+        <w:t>nha</w:t>
+      </w:r>
+      <w:r>
+        <w:t xml:space="preserve"> </w:t>
+      </w:r>
+      <w:r>
+        <w:rPr>
+          <w:lang w:val="en-US"/>
+        </w:rPr>
+        <w:t>a</w:t>
+      </w:r>
+      <w:r>
+        <w:t xml:space="preserve"> </w:t>
+      </w:r>
+      <w:r>
+        <w:rPr>
+          <w:lang w:val="en-US"/>
+        </w:rPr>
+        <w:t>Trọng</w:t>
       </w:r>
     </w:p>
   </w:comment>
-  <w:comment w:id="55" w:author="Nguyễn Văn Hậu" w:date="2026-04-15T09:51:00Z" w:initials="NV">
+  <w:comment w:id="57" w:author="Nguyễn Văn Hậu" w:date="2026-04-22T08:51:00Z" w:initials="NV">
     <w:p>
       <w:pPr>
         <w:pStyle w:val="CommentText"/>
@@ -30100,53 +30162,11 @@
         <w:annotationRef/>
       </w:r>
       <w:r>
-        <w:t xml:space="preserve">Chưa </w:t>
-      </w:r>
-      <w:r>
-        <w:rPr>
-          <w:lang w:val="en-US"/>
-        </w:rPr>
-        <w:t>có</w:t>
-      </w:r>
-      <w:r>
-        <w:t xml:space="preserve"> </w:t>
-      </w:r>
-      <w:r>
-        <w:rPr>
-          <w:lang w:val="en-US"/>
-        </w:rPr>
-        <w:t>ERD</w:t>
-      </w:r>
-      <w:r>
-        <w:t xml:space="preserve"> </w:t>
-      </w:r>
-      <w:r>
-        <w:rPr>
-          <w:lang w:val="en-US"/>
-        </w:rPr>
-        <w:t>nha</w:t>
-      </w:r>
-      <w:r>
-        <w:t xml:space="preserve"> </w:t>
-      </w:r>
-      <w:r>
-        <w:rPr>
-          <w:lang w:val="en-US"/>
-        </w:rPr>
-        <w:t>a</w:t>
-      </w:r>
-      <w:r>
-        <w:t xml:space="preserve"> </w:t>
-      </w:r>
-      <w:r>
-        <w:rPr>
-          <w:lang w:val="en-US"/>
-        </w:rPr>
-        <w:t>Trọng</w:t>
+        <w:t>Ổn</w:t>
       </w:r>
     </w:p>
   </w:comment>
-  <w:comment w:id="58" w:author="Nguyễn Văn Hậu" w:date="2026-04-22T08:51:00Z" w:initials="NV">
+  <w:comment w:id="69" w:author="Nguyễn Văn Hậu" w:date="2026-04-15T09:50:00Z" w:initials="NV">
     <w:p>
       <w:pPr>
         <w:pStyle w:val="CommentText"/>
@@ -30159,160 +30179,143 @@
         <w:annotationRef/>
       </w:r>
       <w:r>
-        <w:t>Ổn</w:t>
-      </w:r>
-    </w:p>
-  </w:comment>
-  <w:comment w:id="70" w:author="Nguyễn Văn Hậu" w:date="2026-04-15T09:50:00Z" w:initials="NV">
+        <w:t>Giảm chi tiết wireframe</w:t>
+      </w:r>
+    </w:p>
     <w:p>
       <w:pPr>
         <w:pStyle w:val="CommentText"/>
         <w:jc w:val="left"/>
       </w:pPr>
-      <w:r>
-        <w:rPr>
-          <w:rStyle w:val="CommentReference"/>
-        </w:rPr>
-        <w:annotationRef/>
-      </w:r>
-      <w:r>
-        <w:t>Giảm chi tiết wireframe</w:t>
-      </w:r>
     </w:p>
     <w:p>
       <w:pPr>
         <w:pStyle w:val="CommentText"/>
         <w:jc w:val="left"/>
       </w:pPr>
-    </w:p>
+      <w:r>
+        <w:t>Thêm bảng tổng hợp các màn hình</w:t>
+      </w:r>
+    </w:p>
+  </w:comment>
+  <w:comment w:id="70" w:author="Guest User" w:date="2026-04-20T11:57:00Z" w:initials="GU">
+    <w:p>
+      <w:pPr>
+        <w:pStyle w:val="CommentText"/>
+      </w:pPr>
+      <w:r>
+        <w:rPr>
+          <w:rStyle w:val="CommentReference"/>
+        </w:rPr>
+        <w:annotationRef/>
+      </w:r>
+      <w:r>
+        <w:t>đon a ơi</w:t>
+      </w:r>
+    </w:p>
+  </w:comment>
+  <w:comment w:id="80" w:author="Nguyễn Văn Hậu" w:date="2026-04-15T09:50:00Z" w:initials="NV">
     <w:p>
       <w:pPr>
         <w:pStyle w:val="CommentText"/>
         <w:jc w:val="left"/>
       </w:pPr>
       <w:r>
-        <w:t>Thêm bảng tổng hợp các màn hình</w:t>
+        <w:rPr>
+          <w:rStyle w:val="CommentReference"/>
+        </w:rPr>
+        <w:annotationRef/>
+      </w:r>
+      <w:r>
+        <w:rPr>
+          <w:lang w:val="en-US"/>
+        </w:rPr>
+        <w:t>Lu</w:t>
+      </w:r>
+      <w:r>
+        <w:t>ồ</w:t>
+      </w:r>
+      <w:r>
+        <w:rPr>
+          <w:lang w:val="en-US"/>
+        </w:rPr>
+        <w:t>ng b</w:t>
+      </w:r>
+      <w:r>
+        <w:t>ớ</w:t>
+      </w:r>
+      <w:r>
+        <w:rPr>
+          <w:lang w:val="en-US"/>
+        </w:rPr>
+        <w:t>t chi ti</w:t>
+      </w:r>
+      <w:r>
+        <w:t>ế</w:t>
+      </w:r>
+      <w:r>
+        <w:rPr>
+          <w:lang w:val="en-US"/>
+        </w:rPr>
+        <w:t>t l</w:t>
+      </w:r>
+      <w:r>
+        <w:t>ạ</w:t>
+      </w:r>
+      <w:r>
+        <w:rPr>
+          <w:lang w:val="en-US"/>
+        </w:rPr>
+        <w:t>i, ch</w:t>
+      </w:r>
+      <w:r>
+        <w:t>ủ</w:t>
+      </w:r>
+      <w:r>
+        <w:rPr>
+          <w:lang w:val="en-US"/>
+        </w:rPr>
+        <w:t xml:space="preserve"> y</w:t>
+      </w:r>
+      <w:r>
+        <w:t>ế</w:t>
+      </w:r>
+      <w:r>
+        <w:rPr>
+          <w:lang w:val="en-US"/>
+        </w:rPr>
+        <w:t>u nói v</w:t>
+      </w:r>
+      <w:r>
+        <w:t>ề</w:t>
+      </w:r>
+      <w:r>
+        <w:rPr>
+          <w:lang w:val="en-US"/>
+        </w:rPr>
+        <w:t xml:space="preserve"> lu</w:t>
+      </w:r>
+      <w:r>
+        <w:t>ồ</w:t>
+      </w:r>
+      <w:r>
+        <w:rPr>
+          <w:lang w:val="en-US"/>
+        </w:rPr>
+        <w:t>ng gi</w:t>
+      </w:r>
+      <w:r>
+        <w:t>ữ</w:t>
+      </w:r>
+      <w:r>
+        <w:rPr>
+          <w:lang w:val="en-US"/>
+        </w:rPr>
+        <w:t>a các màn hình</w:t>
       </w:r>
     </w:p>
   </w:comment>
-  <w:comment w:id="71" w:author="Guest User" w:date="2026-04-20T11:57:00Z" w:initials="GU">
-    <w:p>
-      <w:pPr>
-        <w:pStyle w:val="CommentText"/>
-      </w:pPr>
-      <w:r>
-        <w:rPr>
-          <w:rStyle w:val="CommentReference"/>
-        </w:rPr>
-        <w:annotationRef/>
-      </w:r>
-      <w:r>
-        <w:t>đon a ơi</w:t>
-      </w:r>
-    </w:p>
-  </w:comment>
-  <w:comment w:id="81" w:author="Nguyễn Văn Hậu" w:date="2026-04-15T09:50:00Z" w:initials="NV">
-    <w:p>
-      <w:pPr>
-        <w:pStyle w:val="CommentText"/>
-        <w:jc w:val="left"/>
-      </w:pPr>
-      <w:r>
-        <w:rPr>
-          <w:rStyle w:val="CommentReference"/>
-        </w:rPr>
-        <w:annotationRef/>
-      </w:r>
-      <w:r>
-        <w:rPr>
-          <w:lang w:val="en-US"/>
-        </w:rPr>
-        <w:t>Lu</w:t>
-      </w:r>
-      <w:r>
-        <w:t>ồ</w:t>
-      </w:r>
-      <w:r>
-        <w:rPr>
-          <w:lang w:val="en-US"/>
-        </w:rPr>
-        <w:t>ng b</w:t>
-      </w:r>
-      <w:r>
-        <w:t>ớ</w:t>
-      </w:r>
-      <w:r>
-        <w:rPr>
-          <w:lang w:val="en-US"/>
-        </w:rPr>
-        <w:t>t chi ti</w:t>
-      </w:r>
-      <w:r>
-        <w:t>ế</w:t>
-      </w:r>
-      <w:r>
-        <w:rPr>
-          <w:lang w:val="en-US"/>
-        </w:rPr>
-        <w:t>t l</w:t>
-      </w:r>
-      <w:r>
-        <w:t>ạ</w:t>
-      </w:r>
-      <w:r>
-        <w:rPr>
-          <w:lang w:val="en-US"/>
-        </w:rPr>
-        <w:t>i, ch</w:t>
-      </w:r>
-      <w:r>
-        <w:t>ủ</w:t>
-      </w:r>
-      <w:r>
-        <w:rPr>
-          <w:lang w:val="en-US"/>
-        </w:rPr>
-        <w:t xml:space="preserve"> y</w:t>
-      </w:r>
-      <w:r>
-        <w:t>ế</w:t>
-      </w:r>
-      <w:r>
-        <w:rPr>
-          <w:lang w:val="en-US"/>
-        </w:rPr>
-        <w:t>u nói v</w:t>
-      </w:r>
-      <w:r>
-        <w:t>ề</w:t>
-      </w:r>
-      <w:r>
-        <w:rPr>
-          <w:lang w:val="en-US"/>
-        </w:rPr>
-        <w:t xml:space="preserve"> lu</w:t>
-      </w:r>
-      <w:r>
-        <w:t>ồ</w:t>
-      </w:r>
-      <w:r>
-        <w:rPr>
-          <w:lang w:val="en-US"/>
-        </w:rPr>
-        <w:t>ng gi</w:t>
-      </w:r>
-      <w:r>
-        <w:t>ữ</w:t>
-      </w:r>
-      <w:r>
-        <w:rPr>
-          <w:lang w:val="en-US"/>
-        </w:rPr>
-        <w:t>a các màn hình</w:t>
-      </w:r>
-    </w:p>
-  </w:comment>
-  <w:comment w:id="82" w:author="Nguyễn Văn Hậu" w:date="2026-05-16T08:45:00Z" w:initials="NV">
+  <w:comment w:id="81" w:author="Nguyễn Văn Hậu" w:date="2026-05-16T08:45:00Z" w:initials="NV">
     <w:p>
       <w:pPr>
         <w:pStyle w:val="CommentText"/>
@@ -30726,7 +30729,6 @@
 <w15:commentsEx xmlns:wpc="http://schemas.microsoft.com/office/word/2010/wordprocessingCanvas" xmlns:cx="http://schemas.microsoft.com/office/drawing/2014/chartex" xmlns:cx1="http://schemas.microsoft.com/office/drawing/2015/9/8/chartex" xmlns:cx2="http://schemas.microsoft.com/office/drawing/2015/10/21/chartex" xmlns:cx3="http://schemas.microsoft.com/office/drawing/2016/5/9/chartex" xmlns:cx4="http://schemas.microsoft.com/office/drawing/2016/5/10/chartex" xmlns:cx5="http://schemas.microsoft.com/office/drawing/2016/5/11/chartex" xmlns:cx6="http://schemas.microsoft.com/office/drawing/2016/5/12/chartex" xmlns:cx7="http://schemas.microsoft.com/office/drawing/2016/5/13/chartex" xmlns:cx8="http://schemas.microsoft.com/office/drawing/2016/5/14/chartex" xmlns:mc="http://schemas.openxmlformats.org/markup-compatibility/2006" xmlns:aink="http://schemas.microsoft.com/office/drawing/2016/ink" xmlns:am3d="http://schemas.microsoft.com/office/drawing/2017/model3d" xmlns:o="urn:schemas-microsoft-com:office:office" xmlns:oel="http://schemas.microsoft.com/office/2019/extlst" xmlns:r="http://schemas.openxmlformats.org/officeDocument/2006/relationships" xmlns:m="http://schemas.openxmlformats.org/officeDocument/2006/math" xmlns:v="urn:schemas-microsoft-com:vml" xmlns:wp14="http://schemas.microsoft.com/office/word/2010/wordprocessingDrawing" xmlns:wp="http://schemas.openxmlformats.org/drawingml/2006/wordprocessingDrawing" xmlns:w10="urn:schemas-microsoft-com:office:word" xmlns:w="http://schemas.openxmlformats.org/wordprocessingml/2006/main" xmlns:w14="http://schemas.microsoft.com/office/word/2010/wordml" xmlns:w15="http://schemas.microsoft.com/office/word/2012/wordml" xmlns:w16cex="http://schemas.microsoft.com/office/word/2018/wordml/cex" xmlns:w16cid="http://schemas.microsoft.com/office/word/2016/wordml/cid" xmlns:w16="http://schemas.microsoft.com/office/word/2018/wordml" xmlns:w16du="http://schemas.microsoft.com/office/word/2023/wordml/word16du" xmlns:w16sdtdh="http://schemas.microsoft.com/office/word/2020/wordml/sdtdatahash" xmlns:w16sdtfl="http://schemas.microsoft.com/office/word/2024/wordml/sdtformatlock" xmlns:w16se="http://schemas.microsoft.com/office/word/2015/wordml/symex" xmlns:wpg="http://schemas.microsoft.com/office/word/2010/wordprocessingGroup" xmlns:wpi="http://schemas.microsoft.com/office/word/2010/wordprocessingInk" xmlns:wne="http://schemas.microsoft.com/office/word/2006/wordml" xmlns:wps="http://schemas.microsoft.com/office/word/2010/wordprocessingShape" mc:Ignorable="w14 w15 w16se w16cid w16 w16cex w16sdtdh w16sdtfl w16du wp14">
   <w15:commentEx w15:paraId="745C1D05" w15:done="0"/>
   <w15:commentEx w15:paraId="1396B99C" w15:done="0"/>
-  <w15:commentEx w15:paraId="14FDE77B" w15:done="0"/>
   <w15:commentEx w15:paraId="7A655EF2" w15:done="0"/>
   <w15:commentEx w15:paraId="422663F3" w15:done="0"/>
   <w15:commentEx w15:paraId="0049F672" w15:done="0"/>
@@ -30743,7 +30745,6 @@
 <w16cex:commentsExtensible xmlns:wpc="http://schemas.microsoft.com/office/word/2010/wordprocessingCanvas" xmlns:cx="http://schemas.microsoft.com/office/drawing/2014/chartex" xmlns:cx1="http://schemas.microsoft.com/office/drawing/2015/9/8/chartex" xmlns:cx2="http://schemas.microsoft.com/office/drawing/2015/10/21/chartex" xmlns:cx3="http://schemas.microsoft.com/office/drawing/2016/5/9/chartex" xmlns:cx4="http://schemas.microsoft.com/office/drawing/2016/5/10/chartex" xmlns:cx5="http://schemas.microsoft.com/office/drawing/2016/5/11/chartex" xmlns:cx6="http://schemas.microsoft.com/office/drawing/2016/5/12/chartex" xmlns:cx7="http://schemas.microsoft.com/office/drawing/2016/5/13/chartex" xmlns:cx8="http://schemas.microsoft.com/office/drawing/2016/5/14/chartex" xmlns:cr="http://schemas.microsoft.com/office/comments/2020/reactions" xmlns:mc="http://schemas.openxmlformats.org/markup-compatibility/2006" xmlns:aink="http://schemas.microsoft.com/office/drawing/2016/ink" xmlns:am3d="http://schemas.microsoft.com/office/drawing/2017/model3d" xmlns:o="urn:schemas-microsoft-com:office:office" xmlns:oel="http://schemas.microsoft.com/office/2019/extlst" xmlns:r="http://schemas.openxmlformats.org/officeDocument/2006/relationships" xmlns:m="http://schemas.openxmlformats.org/officeDocument/2006/math" xmlns:v="urn:schemas-microsoft-com:vml" xmlns:wp14="http://schemas.microsoft.com/office/word/2010/wordprocessingDrawing" xmlns:wp="http://schemas.openxmlformats.org/drawingml/2006/wordprocessingDrawing" xmlns:w10="urn:schemas-microsoft-com:office:word" xmlns:w="http://schemas.openxmlformats.org/wordprocessingml/2006/main" xmlns:w14="http://schemas.microsoft.com/office/word/2010/wordml" xmlns:w15="http://schemas.microsoft.com/office/word/2012/wordml" xmlns:w16cex="http://schemas.microsoft.com/office/word/2018/wordml/cex" xmlns:w16cid="http://schemas.microsoft.com/office/word/2016/wordml/cid" xmlns:w16="http://schemas.microsoft.com/office/word/2018/wordml" xmlns:w16du="http://schemas.microsoft.com/office/word/2023/wordml/word16du" xmlns:w16sdtdh="http://schemas.microsoft.com/office/word/2020/wordml/sdtdatahash" xmlns:w16sdtfl="http://schemas.microsoft.com/office/word/2024/wordml/sdtformatlock" xmlns:w16se="http://schemas.microsoft.com/office/word/2015/wordml/symex" xmlns:wpg="http://schemas.microsoft.com/office/word/2010/wordprocessingGroup" xmlns:wpi="http://schemas.microsoft.com/office/word/2010/wordprocessingInk" xmlns:wne="http://schemas.microsoft.com/office/word/2006/wordml" xmlns:wps="http://schemas.microsoft.com/office/word/2010/wordprocessingShape" mc:Ignorable="w14 w15 w16se w16cid w16 w16cex w16sdtdh w16sdtfl cr w16du wp14">
   <w16cex:commentExtensible w16cex:durableId="043DADFC" w16cex:dateUtc="2026-04-22T01:17:00Z"/>
   <w16cex:commentExtensible w16cex:durableId="75FE725D" w16cex:dateUtc="2026-04-22T01:18:00Z"/>
-  <w16cex:commentExtensible w16cex:durableId="4C37EA46" w16cex:dateUtc="2026-04-15T02:52:00Z"/>
   <w16cex:commentExtensible w16cex:durableId="7E3A9A72" w16cex:dateUtc="2026-04-22T01:27:00Z"/>
   <w16cex:commentExtensible w16cex:durableId="77FE90BC" w16cex:dateUtc="2026-04-16T07:11:00Z"/>
   <w16cex:commentExtensible w16cex:durableId="6B77810A" w16cex:dateUtc="2026-04-22T01:29:00Z"/>
@@ -30760,7 +30761,6 @@
 <w16cid:commentsIds xmlns:wpc="http://schemas.microsoft.com/office/word/2010/wordprocessingCanvas" xmlns:cx="http://schemas.microsoft.com/office/drawing/2014/chartex" xmlns:cx1="http://schemas.microsoft.com/office/drawing/2015/9/8/chartex" xmlns:cx2="http://schemas.microsoft.com/office/drawing/2015/10/21/chartex" xmlns:cx3="http://schemas.microsoft.com/office/drawing/2016/5/9/chartex" xmlns:cx4="http://schemas.microsoft.com/office/drawing/2016/5/10/chartex" xmlns:cx5="http://schemas.microsoft.com/office/drawing/2016/5/11/chartex" xmlns:cx6="http://schemas.microsoft.com/office/drawing/2016/5/12/chartex" xmlns:cx7="http://schemas.microsoft.com/office/drawing/2016/5/13/chartex" xmlns:cx8="http://schemas.microsoft.com/office/drawing/2016/5/14/chartex" xmlns:mc="http://schemas.openxmlformats.org/markup-compatibility/2006" xmlns:aink="http://schemas.microsoft.com/office/drawing/2016/ink" xmlns:am3d="http://schemas.microsoft.com/office/drawing/2017/model3d" xmlns:o="urn:schemas-microsoft-com:office:office" xmlns:oel="http://schemas.microsoft.com/office/2019/extlst" xmlns:r="http://schemas.openxmlformats.org/officeDocument/2006/relationships" xmlns:m="http://schemas.openxmlformats.org/officeDocument/2006/math" xmlns:v="urn:schemas-microsoft-com:vml" xmlns:wp14="http://schemas.microsoft.com/office/word/2010/wordprocessingDrawing" xmlns:wp="http://schemas.openxmlformats.org/drawingml/2006/wordprocessingDrawing" xmlns:w10="urn:schemas-microsoft-com:office:word" xmlns:w="http://schemas.openxmlformats.org/wordprocessingml/2006/main" xmlns:w14="http://schemas.microsoft.com/office/word/2010/wordml" xmlns:w15="http://schemas.microsoft.com/office/word/2012/wordml" xmlns:w16cex="http://schemas.microsoft.com/office/word/2018/wordml/cex" xmlns:w16cid="http://schemas.microsoft.com/office/word/2016/wordml/cid" xmlns:w16="http://schemas.microsoft.com/office/word/2018/wordml" xmlns:w16du="http://schemas.microsoft.com/office/word/2023/wordml/word16du" xmlns:w16sdtdh="http://schemas.microsoft.com/office/word/2020/wordml/sdtdatahash" xmlns:w16sdtfl="http://schemas.microsoft.com/office/word/2024/wordml/sdtformatlock" xmlns:w16se="http://schemas.microsoft.com/office/word/2015/wordml/symex" xmlns:wpg="http://schemas.microsoft.com/office/word/2010/wordprocessingGroup" xmlns:wpi="http://schemas.microsoft.com/office/word/2010/wordprocessingInk" xmlns:wne="http://schemas.microsoft.com/office/word/2006/wordml" xmlns:wps="http://schemas.microsoft.com/office/word/2010/wordprocessingShape" mc:Ignorable="w14 w15 w16se w16cid w16 w16cex w16sdtdh w16sdtfl w16du wp14">
   <w16cid:commentId w16cid:paraId="745C1D05" w16cid:durableId="043DADFC"/>
   <w16cid:commentId w16cid:paraId="1396B99C" w16cid:durableId="75FE725D"/>
-  <w16cid:commentId w16cid:paraId="14FDE77B" w16cid:durableId="4C37EA46"/>
   <w16cid:commentId w16cid:paraId="7A655EF2" w16cid:durableId="7E3A9A72"/>
   <w16cid:commentId w16cid:paraId="422663F3" w16cid:durableId="77FE90BC"/>
   <w16cid:commentId w16cid:paraId="0049F672" w16cid:durableId="6B77810A"/>
@@ -43193,6 +43193,10 @@
 </file>
 
 <file path=customXml/item1.xml><?xml version="1.0" encoding="utf-8"?>
+<b:Sources xmlns:b="http://schemas.openxmlformats.org/officeDocument/2006/bibliography" xmlns="http://schemas.openxmlformats.org/officeDocument/2006/bibliography" SelectedStyle="\APASixthEditionOfficeOnline.xsl" StyleName="APA" Version="6"/>
+</file>
+
+<file path=customXml/item2.xml><?xml version="1.0" encoding="utf-8"?>
 <?mso-contentType ?>
 <FormTemplates xmlns="http://schemas.microsoft.com/sharepoint/v3/contenttype/forms">
   <Display>DocumentLibraryForm</Display>
@@ -43201,19 +43205,7 @@
 </FormTemplates>
 </file>
 
-<file path=customXml/item2.xml><?xml version="1.0" encoding="utf-8"?>
-<b:Sources xmlns:b="http://schemas.openxmlformats.org/officeDocument/2006/bibliography" xmlns="http://schemas.openxmlformats.org/officeDocument/2006/bibliography" SelectedStyle="\APASixthEditionOfficeOnline.xsl" StyleName="APA" Version="6"/>
-</file>
-
 <file path=customXml/item3.xml><?xml version="1.0" encoding="utf-8"?>
-<p:properties xmlns:p="http://schemas.microsoft.com/office/2006/metadata/properties" xmlns:xsi="http://www.w3.org/2001/XMLSchema-instance" xmlns:pc="http://schemas.microsoft.com/office/infopath/2007/PartnerControls">
-  <documentManagement>
-    <_activity xmlns="6c5217b2-7a7a-4f0e-8f96-0cd995319a83" xsi:nil="true"/>
-  </documentManagement>
-</p:properties>
-</file>
-
-<file path=customXml/item4.xml><?xml version="1.0" encoding="utf-8"?>
 <ct:contentTypeSchema xmlns:ct="http://schemas.microsoft.com/office/2006/metadata/contentType" xmlns:ma="http://schemas.microsoft.com/office/2006/metadata/properties/metaAttributes" ct:_="" ma:_="" ma:contentTypeName="Document" ma:contentTypeID="0x010100F446CA7B7CF70A498211587FC0BBFFDF" ma:contentTypeVersion="6" ma:contentTypeDescription="Create a new document." ma:contentTypeScope="" ma:versionID="74eddbba188a30244ffb1ca296df06bf">
   <xsd:schema xmlns:xsd="http://www.w3.org/2001/XMLSchema" xmlns:xs="http://www.w3.org/2001/XMLSchema" xmlns:p="http://schemas.microsoft.com/office/2006/metadata/properties" xmlns:ns3="6c5217b2-7a7a-4f0e-8f96-0cd995319a83" targetNamespace="http://schemas.microsoft.com/office/2006/metadata/properties" ma:root="true" ma:fieldsID="7a20fd6f4c64709b7d7e43da22e7aa63" ns3:_="">
     <xsd:import namespace="6c5217b2-7a7a-4f0e-8f96-0cd995319a83"/>
@@ -43369,7 +43361,23 @@
 </ct:contentTypeSchema>
 </file>
 
+<file path=customXml/item4.xml><?xml version="1.0" encoding="utf-8"?>
+<p:properties xmlns:p="http://schemas.microsoft.com/office/2006/metadata/properties" xmlns:xsi="http://www.w3.org/2001/XMLSchema-instance" xmlns:pc="http://schemas.microsoft.com/office/infopath/2007/PartnerControls">
+  <documentManagement>
+    <_activity xmlns="6c5217b2-7a7a-4f0e-8f96-0cd995319a83" xsi:nil="true"/>
+  </documentManagement>
+</p:properties>
+</file>
+
 <file path=customXml/itemProps1.xml><?xml version="1.0" encoding="utf-8"?>
+<ds:datastoreItem xmlns:ds="http://schemas.openxmlformats.org/officeDocument/2006/customXml" ds:itemID="{016C20B6-32D6-4779-9023-9B2CB372EED5}">
+  <ds:schemaRefs>
+    <ds:schemaRef ds:uri="http://schemas.openxmlformats.org/officeDocument/2006/bibliography"/>
+  </ds:schemaRefs>
+</ds:datastoreItem>
+</file>
+
+<file path=customXml/itemProps2.xml><?xml version="1.0" encoding="utf-8"?>
 <ds:datastoreItem xmlns:ds="http://schemas.openxmlformats.org/officeDocument/2006/customXml" ds:itemID="{6145EE74-5F99-4736-AF5C-AFE342E29AF6}">
   <ds:schemaRefs>
     <ds:schemaRef ds:uri="http://schemas.microsoft.com/sharepoint/v3/contenttype/forms"/>
@@ -43377,25 +43385,7 @@
 </ds:datastoreItem>
 </file>
 
-<file path=customXml/itemProps2.xml><?xml version="1.0" encoding="utf-8"?>
-<ds:datastoreItem xmlns:ds="http://schemas.openxmlformats.org/officeDocument/2006/customXml" ds:itemID="{016C20B6-32D6-4779-9023-9B2CB372EED5}">
-  <ds:schemaRefs>
-    <ds:schemaRef ds:uri="http://schemas.openxmlformats.org/officeDocument/2006/bibliography"/>
-  </ds:schemaRefs>
-</ds:datastoreItem>
-</file>
-
 <file path=customXml/itemProps3.xml><?xml version="1.0" encoding="utf-8"?>
-<ds:datastoreItem xmlns:ds="http://schemas.openxmlformats.org/officeDocument/2006/customXml" ds:itemID="{BD6A8824-E082-4A11-8E56-5B68157CC9D0}">
-  <ds:schemaRefs>
-    <ds:schemaRef ds:uri="http://schemas.microsoft.com/office/2006/metadata/properties"/>
-    <ds:schemaRef ds:uri="http://schemas.microsoft.com/office/infopath/2007/PartnerControls"/>
-    <ds:schemaRef ds:uri="6c5217b2-7a7a-4f0e-8f96-0cd995319a83"/>
-  </ds:schemaRefs>
-</ds:datastoreItem>
-</file>
-
-<file path=customXml/itemProps4.xml><?xml version="1.0" encoding="utf-8"?>
 <ds:datastoreItem xmlns:ds="http://schemas.openxmlformats.org/officeDocument/2006/customXml" ds:itemID="{578F24B4-54B1-43DB-BA73-EB8396E9ADCB}">
   <ds:schemaRefs>
     <ds:schemaRef ds:uri="http://schemas.microsoft.com/office/2006/metadata/contentType"/>
@@ -43411,4 +43401,14 @@
     <ds:schemaRef ds:uri="http://schemas.microsoft.com/internal/obd"/>
   </ds:schemaRefs>
 </ds:datastoreItem>
+</file>
+
+<file path=customXml/itemProps4.xml><?xml version="1.0" encoding="utf-8"?>
+<ds:datastoreItem xmlns:ds="http://schemas.openxmlformats.org/officeDocument/2006/customXml" ds:itemID="{BD6A8824-E082-4A11-8E56-5B68157CC9D0}">
+  <ds:schemaRefs>
+    <ds:schemaRef ds:uri="http://schemas.microsoft.com/office/2006/metadata/properties"/>
+    <ds:schemaRef ds:uri="http://schemas.microsoft.com/office/infopath/2007/PartnerControls"/>
+    <ds:schemaRef ds:uri="6c5217b2-7a7a-4f0e-8f96-0cd995319a83"/>
+  </ds:schemaRefs>
+</ds:datastoreItem>
 </file>
</xml_diff>